<commit_message>
Highlight AI research and add language scores and CRM revision manuscript
</commit_message>
<xml_diff>
--- a/uploads/Shu_Hu_CV_EN.docx
+++ b/uploads/Shu_Hu_CV_EN.docx
@@ -19,7 +19,7 @@
         <w:rPr>
           <w:rFonts w:cs="Calibri"/>
           <w:sz w:val="44"/>
-          <w:szCs w:val="21"/>
+          <w:szCs w:val="22"/>
           <w:color w:val="000000"/>
           <w:b/>
         </w:rPr>
@@ -34,7 +34,7 @@
           <w:color w:val="000000" w:themeColor="text1"/>
           <w:szCs w:val="21"/>
         </w:rPr>
-        <w:spacing w:before="0" w:after="60" w:line="280" w:lineRule="exact"/>
+        <w:spacing w:before="0" w:after="60" w:line="320" w:lineRule="exact"/>
         <w:keepLines/>
         <w:snapToGrid w:val="0"/>
         <w:jc w:val="center"/>
@@ -43,7 +43,7 @@
         <w:rPr>
           <w:rFonts w:cs="Calibri"/>
           <w:sz w:val="28"/>
-          <w:szCs w:val="21"/>
+          <w:szCs w:val="22"/>
           <w:color w:val="000000"/>
           <w:b/>
         </w:rPr>
@@ -58,7 +58,7 @@
           <w:color w:val="000000" w:themeColor="text1"/>
           <w:szCs w:val="21"/>
         </w:rPr>
-        <w:spacing w:before="0" w:after="40" w:line="280" w:lineRule="exact"/>
+        <w:spacing w:before="0" w:after="40" w:line="320" w:lineRule="exact"/>
         <w:keepLines/>
         <w:snapToGrid w:val="0"/>
         <w:jc w:val="center"/>
@@ -66,8 +66,8 @@
       <w:r>
         <w:rPr>
           <w:rFonts w:cs="Calibri"/>
-          <w:sz w:val="21"/>
-          <w:szCs w:val="21"/>
+          <w:sz w:val="22"/>
+          <w:szCs w:val="22"/>
           <w:color w:val="000000"/>
         </w:rPr>
         <w:t xml:space="preserve">PhD Student · Department of Microbiology · Fudan University</w:t>
@@ -81,7 +81,7 @@
           <w:color w:val="000000" w:themeColor="text1"/>
           <w:szCs w:val="21"/>
         </w:rPr>
-        <w:spacing w:before="0" w:after="80" w:line="280" w:lineRule="exact"/>
+        <w:spacing w:before="0" w:after="80" w:line="320" w:lineRule="exact"/>
         <w:keepLines/>
         <w:snapToGrid w:val="0"/>
         <w:jc w:val="center"/>
@@ -89,8 +89,8 @@
       <w:r>
         <w:rPr>
           <w:rFonts w:cs="Calibri"/>
-          <w:sz w:val="21"/>
-          <w:szCs w:val="21"/>
+          <w:sz w:val="22"/>
+          <w:szCs w:val="22"/>
           <w:color w:val="000000"/>
         </w:rPr>
         <w:t xml:space="preserve">shu25@m.fudan.edu.cn  |  hushuzuiniu.github.io</w:t>
@@ -133,7 +133,7 @@
           <w:color w:val="000000" w:themeColor="text1"/>
           <w:szCs w:val="21"/>
         </w:rPr>
-        <w:spacing w:before="0" w:after="40" w:line="280" w:lineRule="exact"/>
+        <w:spacing w:before="0" w:after="40" w:line="320" w:lineRule="exact"/>
         <w:keepLines/>
         <w:snapToGrid w:val="0"/>
         <w:keepNext/>
@@ -144,8 +144,8 @@
       <w:r>
         <w:rPr>
           <w:rFonts w:cs="Calibri"/>
-          <w:sz w:val="21"/>
-          <w:szCs w:val="21"/>
+          <w:sz w:val="22"/>
+          <w:szCs w:val="22"/>
           <w:color w:val="000000"/>
           <w:b/>
         </w:rPr>
@@ -154,8 +154,8 @@
       <w:r>
         <w:rPr>
           <w:rFonts w:cs="Calibri"/>
-          <w:sz w:val="21"/>
-          <w:szCs w:val="21"/>
+          <w:sz w:val="22"/>
+          <w:szCs w:val="22"/>
           <w:color w:val="000000"/>
           <w:b/>
         </w:rPr>
@@ -171,15 +171,15 @@
           <w:color w:val="000000" w:themeColor="text1"/>
           <w:szCs w:val="21"/>
         </w:rPr>
-        <w:spacing w:before="0" w:after="80" w:line="280" w:lineRule="exact"/>
-        <w:keepLines/>
-        <w:snapToGrid w:val="0"/>
-      </w:pPr>
-      <w:r>
-        <w:rPr>
-          <w:rFonts w:cs="Calibri"/>
-          <w:sz w:val="21"/>
-          <w:szCs w:val="21"/>
+        <w:spacing w:before="0" w:after="80" w:line="320" w:lineRule="exact"/>
+        <w:keepLines/>
+        <w:snapToGrid w:val="0"/>
+      </w:pPr>
+      <w:r>
+        <w:rPr>
+          <w:rFonts w:cs="Calibri"/>
+          <w:sz w:val="22"/>
+          <w:szCs w:val="22"/>
           <w:color w:val="000000"/>
         </w:rPr>
         <w:t xml:space="preserve">PhD student in Microbiology | Department of Microbiology, School of Life Sciences</w:t>
@@ -193,7 +193,7 @@
           <w:color w:val="000000" w:themeColor="text1"/>
           <w:szCs w:val="21"/>
         </w:rPr>
-        <w:spacing w:before="0" w:after="40" w:line="280" w:lineRule="exact"/>
+        <w:spacing w:before="0" w:after="40" w:line="320" w:lineRule="exact"/>
         <w:keepLines/>
         <w:snapToGrid w:val="0"/>
         <w:keepNext/>
@@ -204,8 +204,8 @@
       <w:r>
         <w:rPr>
           <w:rFonts w:cs="Calibri"/>
-          <w:sz w:val="21"/>
-          <w:szCs w:val="21"/>
+          <w:sz w:val="22"/>
+          <w:szCs w:val="22"/>
           <w:color w:val="000000"/>
           <w:b/>
         </w:rPr>
@@ -214,8 +214,8 @@
       <w:r>
         <w:rPr>
           <w:rFonts w:cs="Calibri"/>
-          <w:sz w:val="21"/>
-          <w:szCs w:val="21"/>
+          <w:sz w:val="22"/>
+          <w:szCs w:val="22"/>
           <w:color w:val="000000"/>
           <w:b/>
         </w:rPr>
@@ -231,15 +231,15 @@
           <w:color w:val="000000" w:themeColor="text1"/>
           <w:szCs w:val="21"/>
         </w:rPr>
-        <w:spacing w:before="0" w:after="80" w:line="280" w:lineRule="exact"/>
-        <w:keepLines/>
-        <w:snapToGrid w:val="0"/>
-      </w:pPr>
-      <w:r>
-        <w:rPr>
-          <w:rFonts w:cs="Calibri"/>
-          <w:sz w:val="21"/>
-          <w:szCs w:val="21"/>
+        <w:spacing w:before="0" w:after="80" w:line="320" w:lineRule="exact"/>
+        <w:keepLines/>
+        <w:snapToGrid w:val="0"/>
+      </w:pPr>
+      <w:r>
+        <w:rPr>
+          <w:rFonts w:cs="Calibri"/>
+          <w:sz w:val="22"/>
+          <w:szCs w:val="22"/>
           <w:color w:val="000000"/>
         </w:rPr>
         <w:t xml:space="preserve">MSc in Bioinformatics, with Merit</w:t>
@@ -253,7 +253,7 @@
           <w:color w:val="000000" w:themeColor="text1"/>
           <w:szCs w:val="21"/>
         </w:rPr>
-        <w:spacing w:before="0" w:after="40" w:line="280" w:lineRule="exact"/>
+        <w:spacing w:before="0" w:after="40" w:line="320" w:lineRule="exact"/>
         <w:keepLines/>
         <w:snapToGrid w:val="0"/>
         <w:keepNext/>
@@ -264,8 +264,8 @@
       <w:r>
         <w:rPr>
           <w:rFonts w:cs="Calibri"/>
-          <w:sz w:val="21"/>
-          <w:szCs w:val="21"/>
+          <w:sz w:val="22"/>
+          <w:szCs w:val="22"/>
           <w:color w:val="000000"/>
           <w:b/>
         </w:rPr>
@@ -274,8 +274,8 @@
       <w:r>
         <w:rPr>
           <w:rFonts w:cs="Calibri"/>
-          <w:sz w:val="21"/>
-          <w:szCs w:val="21"/>
+          <w:sz w:val="22"/>
+          <w:szCs w:val="22"/>
           <w:color w:val="000000"/>
           <w:b/>
         </w:rPr>
@@ -291,18 +291,72 @@
           <w:color w:val="000000" w:themeColor="text1"/>
           <w:szCs w:val="21"/>
         </w:rPr>
-        <w:spacing w:before="0" w:after="80" w:line="280" w:lineRule="exact"/>
-        <w:keepLines/>
-        <w:snapToGrid w:val="0"/>
-      </w:pPr>
-      <w:r>
-        <w:rPr>
-          <w:rFonts w:cs="Calibri"/>
-          <w:sz w:val="21"/>
-          <w:szCs w:val="21"/>
+        <w:spacing w:before="0" w:after="80" w:line="320" w:lineRule="exact"/>
+        <w:keepLines/>
+        <w:snapToGrid w:val="0"/>
+      </w:pPr>
+      <w:r>
+        <w:rPr>
+          <w:rFonts w:cs="Calibri"/>
+          <w:sz w:val="22"/>
+          <w:szCs w:val="22"/>
           <w:color w:val="000000"/>
         </w:rPr>
         <w:t xml:space="preserve">BSc in Biological Science | GPA: 3.8/5.0; average mark: 88/100.</w:t>
+      </w:r>
+    </w:p>
+    <w:p>
+      <w:pPr>
+        <w:rPr>
+          <w:rFonts w:cs="Calibri"/>
+          <w:bCs/>
+          <w:color w:val="000000" w:themeColor="text1"/>
+          <w:szCs w:val="21"/>
+        </w:rPr>
+        <w:spacing w:before="0" w:after="60" w:line="320" w:lineRule="exact"/>
+        <w:keepLines/>
+        <w:snapToGrid w:val="0"/>
+      </w:pPr>
+      <w:r>
+        <w:rPr>
+          <w:rFonts w:cs="Calibri"/>
+          <w:sz w:val="22"/>
+          <w:szCs w:val="22"/>
+          <w:color w:val="000000"/>
+        </w:rPr>
+        <w:t xml:space="preserve">English: CET-6 535; IELTS 6.0.</w:t>
+      </w:r>
+    </w:p>
+    <w:p>
+      <w:pPr>
+        <w:rPr>
+          <w:rFonts w:cs="Calibri"/>
+          <w:bCs/>
+          <w:color w:val="000000" w:themeColor="text1"/>
+          <w:szCs w:val="21"/>
+        </w:rPr>
+        <w:spacing w:before="60" w:after="100" w:line="320" w:lineRule="exact"/>
+        <w:keepLines/>
+        <w:snapToGrid w:val="0"/>
+      </w:pPr>
+      <w:r>
+        <w:rPr>
+          <w:rFonts w:cs="Calibri"/>
+          <w:sz w:val="22"/>
+          <w:szCs w:val="22"/>
+          <w:color w:val="000000"/>
+          <w:b/>
+        </w:rPr>
+        <w:t xml:space="preserve">RESEARCH FOCUS: </w:t>
+      </w:r>
+      <w:r>
+        <w:rPr>
+          <w:rFonts w:cs="Calibri"/>
+          <w:sz w:val="22"/>
+          <w:szCs w:val="22"/>
+          <w:color w:val="000000"/>
+        </w:rPr>
+        <w:t xml:space="preserve">AI foundation models · Sequence representation learning · Deep learning · Viral evolution</w:t>
       </w:r>
     </w:p>
     <w:p>
@@ -331,18 +385,18 @@
           <w:b/>
           <w:highlight w:val="lightGray"/>
         </w:rPr>
-        <w:t xml:space="preserve">PUBLICATIONS</w:t>
-      </w:r>
-    </w:p>
-    <w:p>
-      <w:pPr>
-        <w:rPr>
-          <w:rFonts w:cs="Calibri"/>
-          <w:bCs/>
-          <w:color w:val="000000" w:themeColor="text1"/>
-          <w:szCs w:val="21"/>
-        </w:rPr>
-        <w:spacing w:before="0" w:after="120" w:line="280" w:lineRule="exact"/>
+        <w:t xml:space="preserve">PUBLICATIONS AND MANUSCRIPTS</w:t>
+      </w:r>
+    </w:p>
+    <w:p>
+      <w:pPr>
+        <w:rPr>
+          <w:rFonts w:cs="Calibri"/>
+          <w:bCs/>
+          <w:color w:val="000000" w:themeColor="text1"/>
+          <w:szCs w:val="21"/>
+        </w:rPr>
+        <w:spacing w:before="0" w:after="120" w:line="320" w:lineRule="exact"/>
         <w:keepLines/>
         <w:snapToGrid w:val="0"/>
         <w:ind w:left="280" w:hanging="280"/>
@@ -350,8 +404,8 @@
       <w:r>
         <w:rPr>
           <w:rFonts w:cs="Calibri"/>
-          <w:sz w:val="21"/>
-          <w:szCs w:val="21"/>
+          <w:sz w:val="22"/>
+          <w:szCs w:val="22"/>
           <w:color w:val="000000"/>
         </w:rPr>
         <w:t xml:space="preserve">•</w:t>
@@ -360,8 +414,97 @@
       <w:r>
         <w:rPr>
           <w:rFonts w:cs="Calibri"/>
-          <w:sz w:val="21"/>
-          <w:szCs w:val="21"/>
+          <w:sz w:val="22"/>
+          <w:szCs w:val="22"/>
+          <w:color w:val="000000"/>
+        </w:rPr>
+      </w:r>
+      <w:r>
+        <w:rPr>
+          <w:rFonts w:cs="Calibri"/>
+          <w:sz w:val="22"/>
+          <w:szCs w:val="22"/>
+          <w:color w:val="000000"/>
+          <w:b/>
+        </w:rPr>
+        <w:t xml:space="preserve">Hu S</w:t>
+      </w:r>
+      <w:r>
+        <w:rPr>
+          <w:rFonts w:cs="Calibri"/>
+          <w:sz w:val="22"/>
+          <w:szCs w:val="22"/>
+          <w:color w:val="000000"/>
+        </w:rPr>
+        <w:t xml:space="preserve">, Ye D, Liao M, Xu T, Fan T, Dong N, Cui J</w:t>
+      </w:r>
+      <w:r>
+        <w:rPr>
+          <w:rFonts w:cs="Calibri"/>
+          <w:sz w:val="22"/>
+          <w:szCs w:val="22"/>
+          <w:color w:val="000000"/>
+        </w:rPr>
+        <w:t xml:space="preserve">. Paired Env-antibody representation learning predicts HIV-1 neutralization and traces antibody escape across viral evolution. </w:t>
+      </w:r>
+      <w:r>
+        <w:rPr>
+          <w:rFonts w:cs="Calibri"/>
+          <w:sz w:val="22"/>
+          <w:szCs w:val="22"/>
+          <w:color w:val="000000"/>
+          <w:i/>
+        </w:rPr>
+        <w:t xml:space="preserve">Cell Reports Medicine</w:t>
+      </w:r>
+      <w:r>
+        <w:rPr>
+          <w:rFonts w:cs="Calibri"/>
+          <w:sz w:val="22"/>
+          <w:szCs w:val="22"/>
+          <w:color w:val="000000"/>
+        </w:rPr>
+        <w:t xml:space="preserve">. 2026. </w:t>
+      </w:r>
+      <w:r>
+        <w:rPr>
+          <w:rFonts w:cs="Calibri"/>
+          <w:sz w:val="22"/>
+          <w:szCs w:val="22"/>
+          <w:color w:val="000000"/>
+          <w:b/>
+        </w:rPr>
+        <w:t xml:space="preserve">Under revision · Co-first author</w:t>
+      </w:r>
+    </w:p>
+    <w:p>
+      <w:pPr>
+        <w:rPr>
+          <w:rFonts w:cs="Calibri"/>
+          <w:bCs/>
+          <w:color w:val="000000" w:themeColor="text1"/>
+          <w:szCs w:val="21"/>
+        </w:rPr>
+        <w:spacing w:before="0" w:after="120" w:line="320" w:lineRule="exact"/>
+        <w:keepLines/>
+        <w:snapToGrid w:val="0"/>
+        <w:ind w:left="280" w:hanging="280"/>
+      </w:pPr>
+      <w:r>
+        <w:rPr>
+          <w:rFonts w:cs="Calibri"/>
+          <w:sz w:val="22"/>
+          <w:szCs w:val="22"/>
+          <w:color w:val="000000"/>
+        </w:rPr>
+        <w:t xml:space="preserve">•</w:t>
+        <w:tab/>
+      </w:r>
+      <w:r>
+        <w:rPr>
+          <w:rFonts w:cs="Calibri"/>
+          <w:sz w:val="22"/>
+          <w:szCs w:val="22"/>
           <w:color w:val="000000"/>
         </w:rPr>
         <w:t xml:space="preserve">Ye D, Hu F, Hu H, </w:t>
@@ -369,8 +512,8 @@
       <w:r>
         <w:rPr>
           <w:rFonts w:cs="Calibri"/>
-          <w:sz w:val="21"/>
-          <w:szCs w:val="21"/>
+          <w:sz w:val="22"/>
+          <w:szCs w:val="22"/>
           <w:color w:val="000000"/>
           <w:b/>
         </w:rPr>
@@ -379,8 +522,8 @@
       <w:r>
         <w:rPr>
           <w:rFonts w:cs="Calibri"/>
-          <w:sz w:val="21"/>
-          <w:szCs w:val="21"/>
+          <w:sz w:val="22"/>
+          <w:szCs w:val="22"/>
           <w:color w:val="000000"/>
         </w:rPr>
         <w:t xml:space="preserve">, Tan Y, Ouyang W, Li SZ, Cui J, Dong N</w:t>
@@ -388,8 +531,8 @@
       <w:r>
         <w:rPr>
           <w:rFonts w:cs="Calibri"/>
-          <w:sz w:val="21"/>
-          <w:szCs w:val="21"/>
+          <w:sz w:val="22"/>
+          <w:szCs w:val="22"/>
           <w:color w:val="000000"/>
         </w:rPr>
         <w:t xml:space="preserve">. ViroBench: Benchmarking Nucleotide Foundation Models on Viral Genomics Tasks. </w:t>
@@ -397,8 +540,8 @@
       <w:r>
         <w:rPr>
           <w:rFonts w:cs="Calibri"/>
-          <w:sz w:val="21"/>
-          <w:szCs w:val="21"/>
+          <w:sz w:val="22"/>
+          <w:szCs w:val="22"/>
           <w:color w:val="000000"/>
           <w:i/>
         </w:rPr>
@@ -407,8 +550,8 @@
       <w:r>
         <w:rPr>
           <w:rFonts w:cs="Calibri"/>
-          <w:sz w:val="21"/>
-          <w:szCs w:val="21"/>
+          <w:sz w:val="22"/>
+          <w:szCs w:val="22"/>
           <w:color w:val="000000"/>
         </w:rPr>
         <w:t xml:space="preserve">. 2026; 12679–12690. </w:t>
@@ -417,8 +560,8 @@
         <w:r>
           <w:rPr>
             <w:rFonts w:cs="Calibri"/>
-            <w:sz w:val="21"/>
-            <w:szCs w:val="21"/>
+            <w:sz w:val="22"/>
+            <w:szCs w:val="22"/>
             <w:color w:val="0000FF"/>
           </w:rPr>
           <w:t xml:space="preserve">doi: 10.1145/3770855.3819057</w:t>
@@ -433,7 +576,7 @@
           <w:color w:val="000000" w:themeColor="text1"/>
           <w:szCs w:val="21"/>
         </w:rPr>
-        <w:spacing w:before="0" w:after="120" w:line="280" w:lineRule="exact"/>
+        <w:spacing w:before="0" w:after="120" w:line="320" w:lineRule="exact"/>
         <w:keepLines/>
         <w:snapToGrid w:val="0"/>
         <w:ind w:left="280" w:hanging="280"/>
@@ -441,8 +584,8 @@
       <w:r>
         <w:rPr>
           <w:rFonts w:cs="Calibri"/>
-          <w:sz w:val="21"/>
-          <w:szCs w:val="21"/>
+          <w:sz w:val="22"/>
+          <w:szCs w:val="22"/>
           <w:color w:val="000000"/>
         </w:rPr>
         <w:t xml:space="preserve">•</w:t>
@@ -451,8 +594,8 @@
       <w:r>
         <w:rPr>
           <w:rFonts w:cs="Calibri"/>
-          <w:sz w:val="21"/>
-          <w:szCs w:val="21"/>
+          <w:sz w:val="22"/>
+          <w:szCs w:val="22"/>
           <w:color w:val="000000"/>
         </w:rPr>
         <w:t xml:space="preserve">Schwab LSU, Xie R, Reilly E, Aban M, Spirason N, Deng YM, </w:t>
@@ -460,8 +603,8 @@
       <w:r>
         <w:rPr>
           <w:rFonts w:cs="Calibri"/>
-          <w:sz w:val="21"/>
-          <w:szCs w:val="21"/>
+          <w:sz w:val="22"/>
+          <w:szCs w:val="22"/>
           <w:color w:val="000000"/>
           <w:b/>
         </w:rPr>
@@ -470,8 +613,8 @@
       <w:r>
         <w:rPr>
           <w:rFonts w:cs="Calibri"/>
-          <w:sz w:val="21"/>
-          <w:szCs w:val="21"/>
+          <w:sz w:val="22"/>
+          <w:szCs w:val="22"/>
           <w:color w:val="000000"/>
         </w:rPr>
         <w:t xml:space="preserve">, et al</w:t>
@@ -479,8 +622,8 @@
       <w:r>
         <w:rPr>
           <w:rFonts w:cs="Calibri"/>
-          <w:sz w:val="21"/>
-          <w:szCs w:val="21"/>
+          <w:sz w:val="22"/>
+          <w:szCs w:val="22"/>
           <w:color w:val="000000"/>
         </w:rPr>
         <w:t xml:space="preserve">. Epistasis facilitates the long-term antigenic evolution of the influenza B virus hemagglutinin. </w:t>
@@ -488,8 +631,8 @@
       <w:r>
         <w:rPr>
           <w:rFonts w:cs="Calibri"/>
-          <w:sz w:val="21"/>
-          <w:szCs w:val="21"/>
+          <w:sz w:val="22"/>
+          <w:szCs w:val="22"/>
           <w:color w:val="000000"/>
           <w:i/>
         </w:rPr>
@@ -498,8 +641,8 @@
       <w:r>
         <w:rPr>
           <w:rFonts w:cs="Calibri"/>
-          <w:sz w:val="21"/>
-          <w:szCs w:val="21"/>
+          <w:sz w:val="22"/>
+          <w:szCs w:val="22"/>
           <w:color w:val="000000"/>
         </w:rPr>
         <w:t xml:space="preserve">. 2026. </w:t>
@@ -508,8 +651,8 @@
         <w:r>
           <w:rPr>
             <w:rFonts w:cs="Calibri"/>
-            <w:sz w:val="21"/>
-            <w:szCs w:val="21"/>
+            <w:sz w:val="22"/>
+            <w:szCs w:val="22"/>
             <w:color w:val="0000FF"/>
           </w:rPr>
           <w:t xml:space="preserve">doi: 10.64898/2026.07.22.739994</w:t>
@@ -524,7 +667,7 @@
           <w:color w:val="000000" w:themeColor="text1"/>
           <w:szCs w:val="21"/>
         </w:rPr>
-        <w:spacing w:before="0" w:after="120" w:line="280" w:lineRule="exact"/>
+        <w:spacing w:before="0" w:after="120" w:line="320" w:lineRule="exact"/>
         <w:keepLines/>
         <w:snapToGrid w:val="0"/>
         <w:ind w:left="280" w:hanging="280"/>
@@ -532,8 +675,8 @@
       <w:r>
         <w:rPr>
           <w:rFonts w:cs="Calibri"/>
-          <w:sz w:val="21"/>
-          <w:szCs w:val="21"/>
+          <w:sz w:val="22"/>
+          <w:szCs w:val="22"/>
           <w:color w:val="000000"/>
         </w:rPr>
         <w:t xml:space="preserve">•</w:t>
@@ -542,8 +685,8 @@
       <w:r>
         <w:rPr>
           <w:rFonts w:cs="Calibri"/>
-          <w:sz w:val="21"/>
-          <w:szCs w:val="21"/>
+          <w:sz w:val="22"/>
+          <w:szCs w:val="22"/>
           <w:color w:val="000000"/>
         </w:rPr>
         <w:t xml:space="preserve">Xie R, Zhukova A, Peña PG, Iglesias G, </w:t>
@@ -551,8 +694,8 @@
       <w:r>
         <w:rPr>
           <w:rFonts w:cs="Calibri"/>
-          <w:sz w:val="21"/>
-          <w:szCs w:val="21"/>
+          <w:sz w:val="22"/>
+          <w:szCs w:val="22"/>
           <w:color w:val="000000"/>
           <w:b/>
         </w:rPr>
@@ -561,8 +704,8 @@
       <w:r>
         <w:rPr>
           <w:rFonts w:cs="Calibri"/>
-          <w:sz w:val="21"/>
-          <w:szCs w:val="21"/>
+          <w:sz w:val="22"/>
+          <w:szCs w:val="22"/>
           <w:color w:val="000000"/>
         </w:rPr>
         <w:t xml:space="preserve">, Wang J, Tsang TK, Dhanasekaran V, Kraemer MUG, Pybus OG, Gascuel O</w:t>
@@ -570,8 +713,8 @@
       <w:r>
         <w:rPr>
           <w:rFonts w:cs="Calibri"/>
-          <w:sz w:val="21"/>
-          <w:szCs w:val="21"/>
+          <w:sz w:val="22"/>
+          <w:szCs w:val="22"/>
           <w:color w:val="000000"/>
         </w:rPr>
         <w:t xml:space="preserve">. Scalable deep-learning-based inference of time-varying transmission dynamics from outbreak phylogenies. </w:t>
@@ -579,8 +722,8 @@
       <w:r>
         <w:rPr>
           <w:rFonts w:cs="Calibri"/>
-          <w:sz w:val="21"/>
-          <w:szCs w:val="21"/>
+          <w:sz w:val="22"/>
+          <w:szCs w:val="22"/>
           <w:color w:val="000000"/>
           <w:i/>
         </w:rPr>
@@ -589,8 +732,8 @@
       <w:r>
         <w:rPr>
           <w:rFonts w:cs="Calibri"/>
-          <w:sz w:val="21"/>
-          <w:szCs w:val="21"/>
+          <w:sz w:val="22"/>
+          <w:szCs w:val="22"/>
           <w:color w:val="000000"/>
         </w:rPr>
         <w:t xml:space="preserve">. 2026. </w:t>
@@ -599,8 +742,8 @@
         <w:r>
           <w:rPr>
             <w:rFonts w:cs="Calibri"/>
-            <w:sz w:val="21"/>
-            <w:szCs w:val="21"/>
+            <w:sz w:val="22"/>
+            <w:szCs w:val="22"/>
             <w:color w:val="0000FF"/>
           </w:rPr>
           <w:t xml:space="preserve">doi: 10.64898/2026.05.07.26352673</w:t>
@@ -615,7 +758,7 @@
           <w:color w:val="000000" w:themeColor="text1"/>
           <w:szCs w:val="21"/>
         </w:rPr>
-        <w:spacing w:before="0" w:after="120" w:line="280" w:lineRule="exact"/>
+        <w:spacing w:before="0" w:after="120" w:line="320" w:lineRule="exact"/>
         <w:keepLines/>
         <w:snapToGrid w:val="0"/>
         <w:ind w:left="280" w:hanging="280"/>
@@ -623,8 +766,8 @@
       <w:r>
         <w:rPr>
           <w:rFonts w:cs="Calibri"/>
-          <w:sz w:val="21"/>
-          <w:szCs w:val="21"/>
+          <w:sz w:val="22"/>
+          <w:szCs w:val="22"/>
           <w:color w:val="000000"/>
         </w:rPr>
         <w:t xml:space="preserve">•</w:t>
@@ -633,8 +776,8 @@
       <w:r>
         <w:rPr>
           <w:rFonts w:cs="Calibri"/>
-          <w:sz w:val="21"/>
-          <w:szCs w:val="21"/>
+          <w:sz w:val="22"/>
+          <w:szCs w:val="22"/>
           <w:color w:val="000000"/>
         </w:rPr>
         <w:t xml:space="preserve">Siegers JY, Xie R, Edwards KM, Byrne AMP, </w:t>
@@ -642,8 +785,8 @@
       <w:r>
         <w:rPr>
           <w:rFonts w:cs="Calibri"/>
-          <w:sz w:val="21"/>
-          <w:szCs w:val="21"/>
+          <w:sz w:val="22"/>
+          <w:szCs w:val="22"/>
           <w:color w:val="000000"/>
           <w:b/>
         </w:rPr>
@@ -652,8 +795,8 @@
       <w:r>
         <w:rPr>
           <w:rFonts w:cs="Calibri"/>
-          <w:sz w:val="21"/>
-          <w:szCs w:val="21"/>
+          <w:sz w:val="22"/>
+          <w:szCs w:val="22"/>
           <w:color w:val="000000"/>
         </w:rPr>
         <w:t xml:space="preserve">, et al</w:t>
@@ -661,8 +804,8 @@
       <w:r>
         <w:rPr>
           <w:rFonts w:cs="Calibri"/>
-          <w:sz w:val="21"/>
-          <w:szCs w:val="21"/>
+          <w:sz w:val="22"/>
+          <w:szCs w:val="22"/>
           <w:color w:val="000000"/>
         </w:rPr>
         <w:t xml:space="preserve">. Resurgence of Zoonotic Highly Pathogenic Avian Influenza A(H5N1) Virus in Cambodia. </w:t>
@@ -670,8 +813,8 @@
       <w:r>
         <w:rPr>
           <w:rFonts w:cs="Calibri"/>
-          <w:sz w:val="21"/>
-          <w:szCs w:val="21"/>
+          <w:sz w:val="22"/>
+          <w:szCs w:val="22"/>
           <w:color w:val="000000"/>
           <w:i/>
         </w:rPr>
@@ -680,8 +823,8 @@
       <w:r>
         <w:rPr>
           <w:rFonts w:cs="Calibri"/>
-          <w:sz w:val="21"/>
-          <w:szCs w:val="21"/>
+          <w:sz w:val="22"/>
+          <w:szCs w:val="22"/>
           <w:color w:val="000000"/>
         </w:rPr>
         <w:t xml:space="preserve">. 2025; 393(16):1650–1652. </w:t>
@@ -690,8 +833,8 @@
         <w:r>
           <w:rPr>
             <w:rFonts w:cs="Calibri"/>
-            <w:sz w:val="21"/>
-            <w:szCs w:val="21"/>
+            <w:sz w:val="22"/>
+            <w:szCs w:val="22"/>
             <w:color w:val="0000FF"/>
           </w:rPr>
           <w:t xml:space="preserve">doi: 10.1056/NEJMc2504302</w:t>
@@ -706,7 +849,7 @@
           <w:color w:val="000000" w:themeColor="text1"/>
           <w:szCs w:val="21"/>
         </w:rPr>
-        <w:spacing w:before="0" w:after="120" w:line="280" w:lineRule="exact"/>
+        <w:spacing w:before="0" w:after="120" w:line="320" w:lineRule="exact"/>
         <w:keepLines/>
         <w:snapToGrid w:val="0"/>
         <w:ind w:left="280" w:hanging="280"/>
@@ -714,8 +857,8 @@
       <w:r>
         <w:rPr>
           <w:rFonts w:cs="Calibri"/>
-          <w:sz w:val="21"/>
-          <w:szCs w:val="21"/>
+          <w:sz w:val="22"/>
+          <w:szCs w:val="22"/>
           <w:color w:val="000000"/>
         </w:rPr>
         <w:t xml:space="preserve">•</w:t>
@@ -724,16 +867,16 @@
       <w:r>
         <w:rPr>
           <w:rFonts w:cs="Calibri"/>
-          <w:sz w:val="21"/>
-          <w:szCs w:val="21"/>
-          <w:color w:val="000000"/>
-        </w:rPr>
-      </w:r>
-      <w:r>
-        <w:rPr>
-          <w:rFonts w:cs="Calibri"/>
-          <w:sz w:val="21"/>
-          <w:szCs w:val="21"/>
+          <w:sz w:val="22"/>
+          <w:szCs w:val="22"/>
+          <w:color w:val="000000"/>
+        </w:rPr>
+      </w:r>
+      <w:r>
+        <w:rPr>
+          <w:rFonts w:cs="Calibri"/>
+          <w:sz w:val="22"/>
+          <w:szCs w:val="22"/>
           <w:color w:val="000000"/>
           <w:b/>
         </w:rPr>
@@ -742,8 +885,8 @@
       <w:r>
         <w:rPr>
           <w:rFonts w:cs="Calibri"/>
-          <w:sz w:val="21"/>
-          <w:szCs w:val="21"/>
+          <w:sz w:val="22"/>
+          <w:szCs w:val="22"/>
           <w:color w:val="000000"/>
         </w:rPr>
         <w:t xml:space="preserve">, Cui J</w:t>
@@ -751,8 +894,8 @@
       <w:r>
         <w:rPr>
           <w:rFonts w:cs="Calibri"/>
-          <w:sz w:val="21"/>
-          <w:szCs w:val="21"/>
+          <w:sz w:val="22"/>
+          <w:szCs w:val="22"/>
           <w:color w:val="000000"/>
         </w:rPr>
         <w:t xml:space="preserve">. Cattle H5N1 outbreak in US driven by cow’s “cross-nursing” behaviour: elucidating a novel transmission mechanism. </w:t>
@@ -760,8 +903,8 @@
       <w:r>
         <w:rPr>
           <w:rFonts w:cs="Calibri"/>
-          <w:sz w:val="21"/>
-          <w:szCs w:val="21"/>
+          <w:sz w:val="22"/>
+          <w:szCs w:val="22"/>
           <w:color w:val="000000"/>
           <w:i/>
         </w:rPr>
@@ -770,8 +913,8 @@
       <w:r>
         <w:rPr>
           <w:rFonts w:cs="Calibri"/>
-          <w:sz w:val="21"/>
-          <w:szCs w:val="21"/>
+          <w:sz w:val="22"/>
+          <w:szCs w:val="22"/>
           <w:color w:val="000000"/>
         </w:rPr>
         <w:t xml:space="preserve">. 2025; 14(1):2547736. </w:t>
@@ -780,8 +923,8 @@
         <w:r>
           <w:rPr>
             <w:rFonts w:cs="Calibri"/>
-            <w:sz w:val="21"/>
-            <w:szCs w:val="21"/>
+            <w:sz w:val="22"/>
+            <w:szCs w:val="22"/>
             <w:color w:val="0000FF"/>
           </w:rPr>
           <w:t xml:space="preserve">doi: 10.1080/22221751.2025.2547736</w:t>
@@ -796,7 +939,7 @@
           <w:color w:val="000000" w:themeColor="text1"/>
           <w:szCs w:val="21"/>
         </w:rPr>
-        <w:spacing w:before="0" w:after="120" w:line="280" w:lineRule="exact"/>
+        <w:spacing w:before="0" w:after="120" w:line="320" w:lineRule="exact"/>
         <w:keepLines/>
         <w:snapToGrid w:val="0"/>
         <w:ind w:left="280" w:hanging="280"/>
@@ -804,8 +947,8 @@
       <w:r>
         <w:rPr>
           <w:rFonts w:cs="Calibri"/>
-          <w:sz w:val="21"/>
-          <w:szCs w:val="21"/>
+          <w:sz w:val="22"/>
+          <w:szCs w:val="22"/>
           <w:color w:val="000000"/>
         </w:rPr>
         <w:t xml:space="preserve">•</w:t>
@@ -814,8 +957,8 @@
       <w:r>
         <w:rPr>
           <w:rFonts w:cs="Calibri"/>
-          <w:sz w:val="21"/>
-          <w:szCs w:val="21"/>
+          <w:sz w:val="22"/>
+          <w:szCs w:val="22"/>
           <w:color w:val="000000"/>
         </w:rPr>
         <w:t xml:space="preserve">Yang K, Nizami S, </w:t>
@@ -823,8 +966,8 @@
       <w:r>
         <w:rPr>
           <w:rFonts w:cs="Calibri"/>
-          <w:sz w:val="21"/>
-          <w:szCs w:val="21"/>
+          <w:sz w:val="22"/>
+          <w:szCs w:val="22"/>
           <w:color w:val="000000"/>
           <w:b/>
         </w:rPr>
@@ -833,8 +976,8 @@
       <w:r>
         <w:rPr>
           <w:rFonts w:cs="Calibri"/>
-          <w:sz w:val="21"/>
-          <w:szCs w:val="21"/>
+          <w:sz w:val="22"/>
+          <w:szCs w:val="22"/>
           <w:color w:val="000000"/>
         </w:rPr>
         <w:t xml:space="preserve">, Zou L, Deng H, Xie J, Guo Q, Edwards KM, Dhanasekaran V, Yen HL, Wu J</w:t>
@@ -842,8 +985,8 @@
       <w:r>
         <w:rPr>
           <w:rFonts w:cs="Calibri"/>
-          <w:sz w:val="21"/>
-          <w:szCs w:val="21"/>
+          <w:sz w:val="22"/>
+          <w:szCs w:val="22"/>
           <w:color w:val="000000"/>
         </w:rPr>
         <w:t xml:space="preserve">. Genetic diversity of highly pathogenic avian influenza H5N6 and H5N8 viruses in poultry markets in Guangdong, China, 2020–2022. </w:t>
@@ -851,8 +994,8 @@
       <w:r>
         <w:rPr>
           <w:rFonts w:cs="Calibri"/>
-          <w:sz w:val="21"/>
-          <w:szCs w:val="21"/>
+          <w:sz w:val="22"/>
+          <w:szCs w:val="22"/>
           <w:color w:val="000000"/>
           <w:i/>
         </w:rPr>
@@ -861,8 +1004,8 @@
       <w:r>
         <w:rPr>
           <w:rFonts w:cs="Calibri"/>
-          <w:sz w:val="21"/>
-          <w:szCs w:val="21"/>
+          <w:sz w:val="22"/>
+          <w:szCs w:val="22"/>
           <w:color w:val="000000"/>
         </w:rPr>
         <w:t xml:space="preserve">. 2025; 99(1):e01145-24. </w:t>
@@ -871,8 +1014,8 @@
         <w:r>
           <w:rPr>
             <w:rFonts w:cs="Calibri"/>
-            <w:sz w:val="21"/>
-            <w:szCs w:val="21"/>
+            <w:sz w:val="22"/>
+            <w:szCs w:val="22"/>
             <w:color w:val="0000FF"/>
           </w:rPr>
           <w:t xml:space="preserve">doi: 10.1128/jvi.01145-24</w:t>
@@ -887,7 +1030,7 @@
           <w:color w:val="000000" w:themeColor="text1"/>
           <w:szCs w:val="21"/>
         </w:rPr>
-        <w:spacing w:before="0" w:after="120" w:line="280" w:lineRule="exact"/>
+        <w:spacing w:before="0" w:after="120" w:line="320" w:lineRule="exact"/>
         <w:keepLines/>
         <w:snapToGrid w:val="0"/>
         <w:ind w:left="280" w:hanging="280"/>
@@ -895,8 +1038,8 @@
       <w:r>
         <w:rPr>
           <w:rFonts w:cs="Calibri"/>
-          <w:sz w:val="21"/>
-          <w:szCs w:val="21"/>
+          <w:sz w:val="22"/>
+          <w:szCs w:val="22"/>
           <w:color w:val="000000"/>
         </w:rPr>
         <w:t xml:space="preserve">•</w:t>
@@ -905,8 +1048,8 @@
       <w:r>
         <w:rPr>
           <w:rFonts w:cs="Calibri"/>
-          <w:sz w:val="21"/>
-          <w:szCs w:val="21"/>
+          <w:sz w:val="22"/>
+          <w:szCs w:val="22"/>
           <w:color w:val="000000"/>
         </w:rPr>
         <w:t xml:space="preserve">Xie R, Adam DC, </w:t>
@@ -914,8 +1057,8 @@
       <w:r>
         <w:rPr>
           <w:rFonts w:cs="Calibri"/>
-          <w:sz w:val="21"/>
-          <w:szCs w:val="21"/>
+          <w:sz w:val="22"/>
+          <w:szCs w:val="22"/>
           <w:color w:val="000000"/>
           <w:b/>
         </w:rPr>
@@ -924,8 +1067,8 @@
       <w:r>
         <w:rPr>
           <w:rFonts w:cs="Calibri"/>
-          <w:sz w:val="21"/>
-          <w:szCs w:val="21"/>
+          <w:sz w:val="22"/>
+          <w:szCs w:val="22"/>
           <w:color w:val="000000"/>
         </w:rPr>
         <w:t xml:space="preserve">, Cowling BJ, Gascuel O, Zhukova A, Dhanasekaran V</w:t>
@@ -933,8 +1076,8 @@
       <w:r>
         <w:rPr>
           <w:rFonts w:cs="Calibri"/>
-          <w:sz w:val="21"/>
-          <w:szCs w:val="21"/>
+          <w:sz w:val="22"/>
+          <w:szCs w:val="22"/>
           <w:color w:val="000000"/>
         </w:rPr>
         <w:t xml:space="preserve">. Integrating Contact Tracing Data to Enhance Outbreak Phylodynamic Inference: A Deep Learning Approach. </w:t>
@@ -942,8 +1085,8 @@
       <w:r>
         <w:rPr>
           <w:rFonts w:cs="Calibri"/>
-          <w:sz w:val="21"/>
-          <w:szCs w:val="21"/>
+          <w:sz w:val="22"/>
+          <w:szCs w:val="22"/>
           <w:color w:val="000000"/>
           <w:i/>
         </w:rPr>
@@ -952,8 +1095,8 @@
       <w:r>
         <w:rPr>
           <w:rFonts w:cs="Calibri"/>
-          <w:sz w:val="21"/>
-          <w:szCs w:val="21"/>
+          <w:sz w:val="22"/>
+          <w:szCs w:val="22"/>
           <w:color w:val="000000"/>
         </w:rPr>
         <w:t xml:space="preserve">. 2024; 41(11):msae232. </w:t>
@@ -962,8 +1105,8 @@
         <w:r>
           <w:rPr>
             <w:rFonts w:cs="Calibri"/>
-            <w:sz w:val="21"/>
-            <w:szCs w:val="21"/>
+            <w:sz w:val="22"/>
+            <w:szCs w:val="22"/>
             <w:color w:val="0000FF"/>
           </w:rPr>
           <w:t xml:space="preserve">doi: 10.1093/molbev/msae232</w:t>
@@ -1008,7 +1151,7 @@
           <w:color w:val="000000" w:themeColor="text1"/>
           <w:szCs w:val="21"/>
         </w:rPr>
-        <w:spacing w:before="0" w:after="40" w:line="280" w:lineRule="exact"/>
+        <w:spacing w:before="0" w:after="40" w:line="320" w:lineRule="exact"/>
         <w:keepLines/>
         <w:snapToGrid w:val="0"/>
         <w:keepNext/>
@@ -1019,34 +1162,34 @@
       <w:r>
         <w:rPr>
           <w:rFonts w:cs="Calibri"/>
-          <w:sz w:val="21"/>
-          <w:szCs w:val="21"/>
-          <w:color w:val="000000"/>
-          <w:b/>
-        </w:rPr>
-        <w:t xml:space="preserve">The University of Hong Kong | Research Assistant I</w:t>
-      </w:r>
-      <w:r>
-        <w:rPr>
-          <w:rFonts w:cs="Calibri"/>
-          <w:sz w:val="21"/>
-          <w:szCs w:val="21"/>
+          <w:sz w:val="22"/>
+          <w:szCs w:val="22"/>
+          <w:color w:val="000000"/>
+          <w:b/>
+        </w:rPr>
+        <w:t xml:space="preserve">Fudan University | PhD Research</w:t>
+      </w:r>
+      <w:r>
+        <w:rPr>
+          <w:rFonts w:cs="Calibri"/>
+          <w:sz w:val="22"/>
+          <w:szCs w:val="22"/>
           <w:color w:val="000000"/>
           <w:b/>
         </w:rPr>
         <w:tab/>
-        <w:t xml:space="preserve">2023–2024</w:t>
-      </w:r>
-    </w:p>
-    <w:p>
-      <w:pPr>
-        <w:rPr>
-          <w:rFonts w:cs="Calibri"/>
-          <w:bCs/>
-          <w:color w:val="000000" w:themeColor="text1"/>
-          <w:szCs w:val="21"/>
-        </w:rPr>
-        <w:spacing w:before="0" w:after="80" w:line="280" w:lineRule="exact"/>
+        <w:t xml:space="preserve">Sep 2025 – present</w:t>
+      </w:r>
+    </w:p>
+    <w:p>
+      <w:pPr>
+        <w:rPr>
+          <w:rFonts w:cs="Calibri"/>
+          <w:bCs/>
+          <w:color w:val="000000" w:themeColor="text1"/>
+          <w:szCs w:val="21"/>
+        </w:rPr>
+        <w:spacing w:before="0" w:after="80" w:line="320" w:lineRule="exact"/>
         <w:keepLines/>
         <w:snapToGrid w:val="0"/>
         <w:ind w:left="280" w:hanging="280"/>
@@ -1054,8 +1197,8 @@
       <w:r>
         <w:rPr>
           <w:rFonts w:cs="Calibri"/>
-          <w:sz w:val="21"/>
-          <w:szCs w:val="21"/>
+          <w:sz w:val="22"/>
+          <w:szCs w:val="22"/>
           <w:color w:val="000000"/>
         </w:rPr>
         <w:t xml:space="preserve">•</w:t>
@@ -1064,22 +1207,22 @@
       <w:r>
         <w:rPr>
           <w:rFonts w:cs="Calibri"/>
-          <w:sz w:val="21"/>
-          <w:szCs w:val="21"/>
-          <w:color w:val="000000"/>
-        </w:rPr>
-        <w:t xml:space="preserve">Conducted bioinformatics analyses of viral evolution and genomic epidemiology, with a focus on influenza and RSV.</w:t>
-      </w:r>
-    </w:p>
-    <w:p>
-      <w:pPr>
-        <w:rPr>
-          <w:rFonts w:cs="Calibri"/>
-          <w:bCs/>
-          <w:color w:val="000000" w:themeColor="text1"/>
-          <w:szCs w:val="21"/>
-        </w:rPr>
-        <w:spacing w:before="0" w:after="80" w:line="280" w:lineRule="exact"/>
+          <w:sz w:val="22"/>
+          <w:szCs w:val="22"/>
+          <w:color w:val="000000"/>
+        </w:rPr>
+        <w:t xml:space="preserve">Co-developed the UniCAV model and training framework; curated datasets, conducted computational analyses and benchmarks, and drafted the manuscript (co-first author; Cell Reports Medicine, under revision).</w:t>
+      </w:r>
+    </w:p>
+    <w:p>
+      <w:pPr>
+        <w:rPr>
+          <w:rFonts w:cs="Calibri"/>
+          <w:bCs/>
+          <w:color w:val="000000" w:themeColor="text1"/>
+          <w:szCs w:val="21"/>
+        </w:rPr>
+        <w:spacing w:before="0" w:after="80" w:line="320" w:lineRule="exact"/>
         <w:keepLines/>
         <w:snapToGrid w:val="0"/>
         <w:ind w:left="280" w:hanging="280"/>
@@ -1087,8 +1230,8 @@
       <w:r>
         <w:rPr>
           <w:rFonts w:cs="Calibri"/>
-          <w:sz w:val="21"/>
-          <w:szCs w:val="21"/>
+          <w:sz w:val="22"/>
+          <w:szCs w:val="22"/>
           <w:color w:val="000000"/>
         </w:rPr>
         <w:t xml:space="preserve">•</w:t>
@@ -1097,267 +1240,22 @@
       <w:r>
         <w:rPr>
           <w:rFonts w:cs="Calibri"/>
-          <w:sz w:val="21"/>
-          <w:szCs w:val="21"/>
-          <w:color w:val="000000"/>
-        </w:rPr>
-        <w:t xml:space="preserve">Integrated genomic, clinical and immunological datasets and contributed to collaborative research publications.</w:t>
-      </w:r>
-    </w:p>
-    <w:p>
-      <w:pPr>
-        <w:rPr>
-          <w:rFonts w:cs="Calibri"/>
-          <w:bCs/>
-          <w:color w:val="000000" w:themeColor="text1"/>
-          <w:szCs w:val="21"/>
-        </w:rPr>
-        <w:spacing w:before="0" w:after="80" w:line="280" w:lineRule="exact"/>
-        <w:keepLines/>
-        <w:snapToGrid w:val="0"/>
-        <w:ind w:left="280" w:hanging="280"/>
-      </w:pPr>
-      <w:r>
-        <w:rPr>
-          <w:rFonts w:cs="Calibri"/>
-          <w:sz w:val="21"/>
-          <w:szCs w:val="21"/>
-          <w:color w:val="000000"/>
-        </w:rPr>
-        <w:t xml:space="preserve">•</w:t>
-        <w:tab/>
-      </w:r>
-      <w:r>
-        <w:rPr>
-          <w:rFonts w:cs="Calibri"/>
-          <w:sz w:val="21"/>
-          <w:szCs w:val="21"/>
-          <w:color w:val="000000"/>
-        </w:rPr>
-        <w:t xml:space="preserve">Contributed to research integrating contact-tracing data with phylogenetic analysis for outbreak inference; co-authored the resulting Molecular Biology and Evolution paper (2024).</w:t>
-      </w:r>
-    </w:p>
-    <w:p>
-      <w:pPr>
-        <w:rPr>
-          <w:rFonts w:cs="Calibri"/>
-          <w:bCs/>
-          <w:color w:val="000000" w:themeColor="text1"/>
-          <w:szCs w:val="21"/>
-        </w:rPr>
-        <w:spacing w:before="0" w:after="140" w:line="280" w:lineRule="exact"/>
-        <w:keepLines/>
-        <w:snapToGrid w:val="0"/>
-        <w:ind w:left="280" w:hanging="280"/>
-      </w:pPr>
-      <w:r>
-        <w:rPr>
-          <w:rFonts w:cs="Calibri"/>
-          <w:sz w:val="21"/>
-          <w:szCs w:val="21"/>
-          <w:color w:val="000000"/>
-        </w:rPr>
-        <w:t xml:space="preserve">•</w:t>
-        <w:tab/>
-      </w:r>
-      <w:r>
-        <w:rPr>
-          <w:rFonts w:cs="Calibri"/>
-          <w:sz w:val="21"/>
-          <w:szCs w:val="21"/>
-          <w:color w:val="000000"/>
-        </w:rPr>
-        <w:t xml:space="preserve">Participated in genomic epidemiology studies of avian influenza in Cambodia and southern China, contributing to publications in NEJM and Journal of Virology (2025).</w:t>
-      </w:r>
-    </w:p>
-    <w:p>
-      <w:pPr>
-        <w:rPr>
-          <w:rFonts w:cs="Calibri"/>
-          <w:bCs/>
-          <w:color w:val="000000" w:themeColor="text1"/>
-          <w:szCs w:val="21"/>
-        </w:rPr>
-        <w:spacing w:before="80" w:after="40" w:line="280" w:lineRule="exact"/>
-        <w:keepLines/>
-        <w:snapToGrid w:val="0"/>
-        <w:keepNext/>
-      </w:pPr>
-      <w:r>
-        <w:rPr>
-          <w:rFonts w:cs="Calibri"/>
-          <w:sz w:val="21"/>
-          <w:szCs w:val="21"/>
-          <w:color w:val="000000"/>
-          <w:b/>
-        </w:rPr>
-        <w:t xml:space="preserve">Shanghai Rightongene Technology Co., Ltd. | Bioinformatics Engineer</w:t>
-      </w:r>
-    </w:p>
-    <w:p>
-      <w:pPr>
-        <w:rPr>
-          <w:rFonts w:cs="Calibri"/>
-          <w:bCs/>
-          <w:color w:val="000000" w:themeColor="text1"/>
-          <w:szCs w:val="21"/>
-        </w:rPr>
-        <w:spacing w:before="0" w:after="80" w:line="280" w:lineRule="exact"/>
-        <w:keepLines/>
-        <w:snapToGrid w:val="0"/>
-        <w:keepNext/>
-      </w:pPr>
-      <w:r>
-        <w:rPr>
-          <w:rFonts w:cs="Calibri"/>
-          <w:sz w:val="21"/>
-          <w:szCs w:val="21"/>
-          <w:color w:val="000000"/>
-        </w:rPr>
-        <w:t xml:space="preserve">2024 – May 2025; Sep 2022 – May 2023</w:t>
-      </w:r>
-    </w:p>
-    <w:p>
-      <w:pPr>
-        <w:rPr>
-          <w:rFonts w:cs="Calibri"/>
-          <w:bCs/>
-          <w:color w:val="000000" w:themeColor="text1"/>
-          <w:szCs w:val="21"/>
-        </w:rPr>
-        <w:spacing w:before="0" w:after="80" w:line="280" w:lineRule="exact"/>
-        <w:keepLines/>
-        <w:snapToGrid w:val="0"/>
-        <w:ind w:left="280" w:hanging="280"/>
-      </w:pPr>
-      <w:r>
-        <w:rPr>
-          <w:rFonts w:cs="Calibri"/>
-          <w:sz w:val="21"/>
-          <w:szCs w:val="21"/>
-          <w:color w:val="000000"/>
-        </w:rPr>
-        <w:t xml:space="preserve">•</w:t>
-        <w:tab/>
-      </w:r>
-      <w:r>
-        <w:rPr>
-          <w:rFonts w:cs="Calibri"/>
-          <w:sz w:val="21"/>
-          <w:szCs w:val="21"/>
-          <w:color w:val="000000"/>
-        </w:rPr>
-        <w:t xml:space="preserve">Developed analysis methods for BCL6, BCL2 and MYC gene fusions in DLBCL sequencing workflows, addressing discrepancies between NGS and FISH results.</w:t>
-      </w:r>
-    </w:p>
-    <w:p>
-      <w:pPr>
-        <w:rPr>
-          <w:rFonts w:cs="Calibri"/>
-          <w:bCs/>
-          <w:color w:val="000000" w:themeColor="text1"/>
-          <w:szCs w:val="21"/>
-        </w:rPr>
-        <w:spacing w:before="0" w:after="80" w:line="280" w:lineRule="exact"/>
-        <w:keepLines/>
-        <w:snapToGrid w:val="0"/>
-        <w:ind w:left="280" w:hanging="280"/>
-      </w:pPr>
-      <w:r>
-        <w:rPr>
-          <w:rFonts w:cs="Calibri"/>
-          <w:sz w:val="21"/>
-          <w:szCs w:val="21"/>
-          <w:color w:val="000000"/>
-        </w:rPr>
-        <w:t xml:space="preserve">•</w:t>
-        <w:tab/>
-      </w:r>
-      <w:r>
-        <w:rPr>
-          <w:rFonts w:cs="Calibri"/>
-          <w:sz w:val="21"/>
-          <w:szCs w:val="21"/>
-          <w:color w:val="000000"/>
-        </w:rPr>
-        <w:t xml:space="preserve">Established low-depth whole-genome sequencing workflows for copy-number analysis using QDNAseq, Control-FREEC and ichorCNA.</w:t>
-      </w:r>
-    </w:p>
-    <w:p>
-      <w:pPr>
-        <w:rPr>
-          <w:rFonts w:cs="Calibri"/>
-          <w:bCs/>
-          <w:color w:val="000000" w:themeColor="text1"/>
-          <w:szCs w:val="21"/>
-        </w:rPr>
-        <w:spacing w:before="0" w:after="80" w:line="280" w:lineRule="exact"/>
-        <w:keepLines/>
-        <w:snapToGrid w:val="0"/>
-        <w:ind w:left="280" w:hanging="280"/>
-      </w:pPr>
-      <w:r>
-        <w:rPr>
-          <w:rFonts w:cs="Calibri"/>
-          <w:sz w:val="21"/>
-          <w:szCs w:val="21"/>
-          <w:color w:val="000000"/>
-        </w:rPr>
-        <w:t xml:space="preserve">•</w:t>
-        <w:tab/>
-      </w:r>
-      <w:r>
-        <w:rPr>
-          <w:rFonts w:cs="Calibri"/>
-          <w:sz w:val="21"/>
-          <w:szCs w:val="21"/>
-          <w:color w:val="000000"/>
-        </w:rPr>
-        <w:t xml:space="preserve">Built upstream and downstream single-cell RNA-seq workflows and collaborated with IT colleagues to deploy analyses on an automated platform.</w:t>
-      </w:r>
-    </w:p>
-    <w:p>
-      <w:pPr>
-        <w:rPr>
-          <w:rFonts w:cs="Calibri"/>
-          <w:bCs/>
-          <w:color w:val="000000" w:themeColor="text1"/>
-          <w:szCs w:val="21"/>
-        </w:rPr>
-        <w:spacing w:before="0" w:after="80" w:line="280" w:lineRule="exact"/>
-        <w:keepLines/>
-        <w:snapToGrid w:val="0"/>
-        <w:ind w:left="280" w:hanging="280"/>
-      </w:pPr>
-      <w:r>
-        <w:rPr>
-          <w:rFonts w:cs="Calibri"/>
-          <w:sz w:val="21"/>
-          <w:szCs w:val="21"/>
-          <w:color w:val="000000"/>
-        </w:rPr>
-        <w:t xml:space="preserve">•</w:t>
-        <w:tab/>
-      </w:r>
-      <w:r>
-        <w:rPr>
-          <w:rFonts w:cs="Calibri"/>
-          <w:sz w:val="21"/>
-          <w:szCs w:val="21"/>
-          <w:color w:val="000000"/>
-        </w:rPr>
-        <w:t xml:space="preserve">Developed RNA-seq expression-based models for leukemia molecular subtyping.</w:t>
-      </w:r>
-    </w:p>
-    <w:p>
-      <w:pPr>
-        <w:rPr>
-          <w:rFonts w:cs="Calibri"/>
-          <w:bCs/>
-          <w:color w:val="000000" w:themeColor="text1"/>
-          <w:szCs w:val="21"/>
-        </w:rPr>
-        <w:spacing w:before="100" w:after="40" w:line="280" w:lineRule="exact"/>
+          <w:sz w:val="22"/>
+          <w:szCs w:val="22"/>
+          <w:color w:val="000000"/>
+        </w:rPr>
+        <w:t xml:space="preserve">Contributed to ViroBench, a benchmark study of nucleotide foundation models published at KDD 2026.</w:t>
+      </w:r>
+    </w:p>
+    <w:p>
+      <w:pPr>
+        <w:rPr>
+          <w:rFonts w:cs="Calibri"/>
+          <w:bCs/>
+          <w:color w:val="000000" w:themeColor="text1"/>
+          <w:szCs w:val="21"/>
+        </w:rPr>
+        <w:spacing w:before="0" w:after="40" w:line="320" w:lineRule="exact"/>
         <w:keepLines/>
         <w:snapToGrid w:val="0"/>
         <w:keepNext/>
@@ -1368,8 +1266,324 @@
       <w:r>
         <w:rPr>
           <w:rFonts w:cs="Calibri"/>
-          <w:sz w:val="21"/>
-          <w:szCs w:val="21"/>
+          <w:sz w:val="22"/>
+          <w:szCs w:val="22"/>
+          <w:color w:val="000000"/>
+          <w:b/>
+        </w:rPr>
+        <w:t xml:space="preserve">The University of Hong Kong | Research Assistant I</w:t>
+      </w:r>
+      <w:r>
+        <w:rPr>
+          <w:rFonts w:cs="Calibri"/>
+          <w:sz w:val="22"/>
+          <w:szCs w:val="22"/>
+          <w:color w:val="000000"/>
+          <w:b/>
+        </w:rPr>
+        <w:tab/>
+        <w:t xml:space="preserve">2023–2024</w:t>
+      </w:r>
+    </w:p>
+    <w:p>
+      <w:pPr>
+        <w:rPr>
+          <w:rFonts w:cs="Calibri"/>
+          <w:bCs/>
+          <w:color w:val="000000" w:themeColor="text1"/>
+          <w:szCs w:val="21"/>
+        </w:rPr>
+        <w:spacing w:before="0" w:after="80" w:line="320" w:lineRule="exact"/>
+        <w:keepLines/>
+        <w:snapToGrid w:val="0"/>
+        <w:ind w:left="280" w:hanging="280"/>
+      </w:pPr>
+      <w:r>
+        <w:rPr>
+          <w:rFonts w:cs="Calibri"/>
+          <w:sz w:val="22"/>
+          <w:szCs w:val="22"/>
+          <w:color w:val="000000"/>
+        </w:rPr>
+        <w:t xml:space="preserve">•</w:t>
+        <w:tab/>
+      </w:r>
+      <w:r>
+        <w:rPr>
+          <w:rFonts w:cs="Calibri"/>
+          <w:sz w:val="22"/>
+          <w:szCs w:val="22"/>
+          <w:color w:val="000000"/>
+        </w:rPr>
+        <w:t xml:space="preserve">Conducted bioinformatics analyses of influenza and RSV, integrating genomic, clinical and immunological datasets.</w:t>
+      </w:r>
+    </w:p>
+    <w:p>
+      <w:pPr>
+        <w:rPr>
+          <w:rFonts w:cs="Calibri"/>
+          <w:bCs/>
+          <w:color w:val="000000" w:themeColor="text1"/>
+          <w:szCs w:val="21"/>
+        </w:rPr>
+        <w:spacing w:before="0" w:after="80" w:line="320" w:lineRule="exact"/>
+        <w:keepLines/>
+        <w:snapToGrid w:val="0"/>
+        <w:ind w:left="280" w:hanging="280"/>
+      </w:pPr>
+      <w:r>
+        <w:rPr>
+          <w:rFonts w:cs="Calibri"/>
+          <w:sz w:val="22"/>
+          <w:szCs w:val="22"/>
+          <w:color w:val="000000"/>
+        </w:rPr>
+        <w:t xml:space="preserve">•</w:t>
+        <w:tab/>
+      </w:r>
+      <w:r>
+        <w:rPr>
+          <w:rFonts w:cs="Calibri"/>
+          <w:sz w:val="22"/>
+          <w:szCs w:val="22"/>
+          <w:color w:val="000000"/>
+        </w:rPr>
+        <w:t xml:space="preserve">Contributed to research integrating contact-tracing data with phylogenetic analysis for outbreak inference; co-authored the resulting Molecular Biology and Evolution paper (2024).</w:t>
+      </w:r>
+    </w:p>
+    <w:p>
+      <w:pPr>
+        <w:rPr>
+          <w:rFonts w:cs="Calibri"/>
+          <w:bCs/>
+          <w:color w:val="000000" w:themeColor="text1"/>
+          <w:szCs w:val="21"/>
+        </w:rPr>
+        <w:spacing w:before="0" w:after="140" w:line="320" w:lineRule="exact"/>
+        <w:keepLines/>
+        <w:snapToGrid w:val="0"/>
+        <w:ind w:left="280" w:hanging="280"/>
+      </w:pPr>
+      <w:r>
+        <w:rPr>
+          <w:rFonts w:cs="Calibri"/>
+          <w:sz w:val="22"/>
+          <w:szCs w:val="22"/>
+          <w:color w:val="000000"/>
+        </w:rPr>
+        <w:t xml:space="preserve">•</w:t>
+        <w:tab/>
+      </w:r>
+      <w:r>
+        <w:rPr>
+          <w:rFonts w:cs="Calibri"/>
+          <w:sz w:val="22"/>
+          <w:szCs w:val="22"/>
+          <w:color w:val="000000"/>
+        </w:rPr>
+        <w:t xml:space="preserve">Participated in genomic epidemiology studies of avian influenza in Cambodia and southern China, contributing to publications in NEJM and Journal of Virology (2025).</w:t>
+      </w:r>
+    </w:p>
+    <w:p>
+      <w:pPr>
+        <w:rPr>
+          <w:rFonts w:cs="Calibri"/>
+          <w:bCs/>
+          <w:color w:val="000000" w:themeColor="text1"/>
+          <w:szCs w:val="21"/>
+        </w:rPr>
+        <w:spacing w:before="80" w:after="40" w:line="320" w:lineRule="exact"/>
+        <w:keepLines/>
+        <w:snapToGrid w:val="0"/>
+        <w:keepNext/>
+      </w:pPr>
+      <w:r>
+        <w:rPr>
+          <w:rFonts w:cs="Calibri"/>
+          <w:sz w:val="22"/>
+          <w:szCs w:val="22"/>
+          <w:color w:val="000000"/>
+          <w:b/>
+        </w:rPr>
+        <w:t xml:space="preserve">Shanghai Rightongene Technology Co., Ltd. | Bioinformatics Engineer</w:t>
+      </w:r>
+    </w:p>
+    <w:p>
+      <w:pPr>
+        <w:rPr>
+          <w:rFonts w:cs="Calibri"/>
+          <w:bCs/>
+          <w:color w:val="000000" w:themeColor="text1"/>
+          <w:szCs w:val="21"/>
+        </w:rPr>
+        <w:spacing w:before="0" w:after="80" w:line="320" w:lineRule="exact"/>
+        <w:keepLines/>
+        <w:snapToGrid w:val="0"/>
+        <w:keepNext/>
+      </w:pPr>
+      <w:r>
+        <w:rPr>
+          <w:rFonts w:cs="Calibri"/>
+          <w:sz w:val="22"/>
+          <w:szCs w:val="22"/>
+          <w:color w:val="000000"/>
+        </w:rPr>
+        <w:t xml:space="preserve">2024 – May 2025; Sep 2022 – May 2023</w:t>
+      </w:r>
+    </w:p>
+    <w:p>
+      <w:pPr>
+        <w:rPr>
+          <w:rFonts w:cs="Calibri"/>
+          <w:bCs/>
+          <w:color w:val="000000" w:themeColor="text1"/>
+          <w:szCs w:val="21"/>
+        </w:rPr>
+        <w:spacing w:before="0" w:after="80" w:line="320" w:lineRule="exact"/>
+        <w:keepLines/>
+        <w:snapToGrid w:val="0"/>
+        <w:ind w:left="280" w:hanging="280"/>
+      </w:pPr>
+      <w:r>
+        <w:rPr>
+          <w:rFonts w:cs="Calibri"/>
+          <w:sz w:val="22"/>
+          <w:szCs w:val="22"/>
+          <w:color w:val="000000"/>
+        </w:rPr>
+        <w:t xml:space="preserve">•</w:t>
+        <w:tab/>
+      </w:r>
+      <w:r>
+        <w:rPr>
+          <w:rFonts w:cs="Calibri"/>
+          <w:sz w:val="22"/>
+          <w:szCs w:val="22"/>
+          <w:color w:val="000000"/>
+        </w:rPr>
+        <w:t xml:space="preserve">Developed analysis methods for BCL6, BCL2 and MYC gene fusions in DLBCL sequencing workflows, addressing discrepancies between NGS and FISH results.</w:t>
+      </w:r>
+    </w:p>
+    <w:p>
+      <w:pPr>
+        <w:rPr>
+          <w:rFonts w:cs="Calibri"/>
+          <w:bCs/>
+          <w:color w:val="000000" w:themeColor="text1"/>
+          <w:szCs w:val="21"/>
+        </w:rPr>
+        <w:spacing w:before="0" w:after="80" w:line="320" w:lineRule="exact"/>
+        <w:keepLines/>
+        <w:snapToGrid w:val="0"/>
+        <w:ind w:left="280" w:hanging="280"/>
+      </w:pPr>
+      <w:r>
+        <w:rPr>
+          <w:rFonts w:cs="Calibri"/>
+          <w:sz w:val="22"/>
+          <w:szCs w:val="22"/>
+          <w:color w:val="000000"/>
+        </w:rPr>
+        <w:t xml:space="preserve">•</w:t>
+        <w:tab/>
+      </w:r>
+      <w:r>
+        <w:rPr>
+          <w:rFonts w:cs="Calibri"/>
+          <w:sz w:val="22"/>
+          <w:szCs w:val="22"/>
+          <w:color w:val="000000"/>
+        </w:rPr>
+        <w:t xml:space="preserve">Established low-depth whole-genome sequencing workflows for copy-number analysis using QDNAseq, Control-FREEC and ichorCNA.</w:t>
+      </w:r>
+    </w:p>
+    <w:p>
+      <w:pPr>
+        <w:rPr>
+          <w:rFonts w:cs="Calibri"/>
+          <w:bCs/>
+          <w:color w:val="000000" w:themeColor="text1"/>
+          <w:szCs w:val="21"/>
+        </w:rPr>
+        <w:spacing w:before="0" w:after="80" w:line="320" w:lineRule="exact"/>
+        <w:keepLines/>
+        <w:snapToGrid w:val="0"/>
+        <w:ind w:left="280" w:hanging="280"/>
+      </w:pPr>
+      <w:r>
+        <w:rPr>
+          <w:rFonts w:cs="Calibri"/>
+          <w:sz w:val="22"/>
+          <w:szCs w:val="22"/>
+          <w:color w:val="000000"/>
+        </w:rPr>
+        <w:t xml:space="preserve">•</w:t>
+        <w:tab/>
+      </w:r>
+      <w:r>
+        <w:rPr>
+          <w:rFonts w:cs="Calibri"/>
+          <w:sz w:val="22"/>
+          <w:szCs w:val="22"/>
+          <w:color w:val="000000"/>
+        </w:rPr>
+        <w:t xml:space="preserve">Built upstream and downstream single-cell RNA-seq workflows and collaborated with IT colleagues to deploy analyses on an automated platform.</w:t>
+      </w:r>
+    </w:p>
+    <w:p>
+      <w:pPr>
+        <w:rPr>
+          <w:rFonts w:cs="Calibri"/>
+          <w:bCs/>
+          <w:color w:val="000000" w:themeColor="text1"/>
+          <w:szCs w:val="21"/>
+        </w:rPr>
+        <w:spacing w:before="0" w:after="80" w:line="320" w:lineRule="exact"/>
+        <w:keepLines/>
+        <w:snapToGrid w:val="0"/>
+        <w:ind w:left="280" w:hanging="280"/>
+      </w:pPr>
+      <w:r>
+        <w:rPr>
+          <w:rFonts w:cs="Calibri"/>
+          <w:sz w:val="22"/>
+          <w:szCs w:val="22"/>
+          <w:color w:val="000000"/>
+        </w:rPr>
+        <w:t xml:space="preserve">•</w:t>
+        <w:tab/>
+      </w:r>
+      <w:r>
+        <w:rPr>
+          <w:rFonts w:cs="Calibri"/>
+          <w:sz w:val="22"/>
+          <w:szCs w:val="22"/>
+          <w:color w:val="000000"/>
+        </w:rPr>
+        <w:t xml:space="preserve">Developed RNA-seq expression-based models for leukemia molecular subtyping.</w:t>
+      </w:r>
+    </w:p>
+    <w:p>
+      <w:pPr>
+        <w:rPr>
+          <w:rFonts w:cs="Calibri"/>
+          <w:bCs/>
+          <w:color w:val="000000" w:themeColor="text1"/>
+          <w:szCs w:val="21"/>
+        </w:rPr>
+        <w:spacing w:before="100" w:after="40" w:line="320" w:lineRule="exact"/>
+        <w:keepLines/>
+        <w:snapToGrid w:val="0"/>
+        <w:keepNext/>
+        <w:tabs>
+          <w:tab w:val="right" w:pos="10465"/>
+        </w:tabs>
+      </w:pPr>
+      <w:r>
+        <w:rPr>
+          <w:rFonts w:cs="Calibri"/>
+          <w:sz w:val="22"/>
+          <w:szCs w:val="22"/>
           <w:color w:val="000000"/>
           <w:b/>
         </w:rPr>
@@ -1378,8 +1592,8 @@
       <w:r>
         <w:rPr>
           <w:rFonts w:cs="Calibri"/>
-          <w:sz w:val="21"/>
-          <w:szCs w:val="21"/>
+          <w:sz w:val="22"/>
+          <w:szCs w:val="22"/>
           <w:color w:val="000000"/>
           <w:b/>
         </w:rPr>
@@ -1395,7 +1609,7 @@
           <w:color w:val="000000" w:themeColor="text1"/>
           <w:szCs w:val="21"/>
         </w:rPr>
-        <w:spacing w:before="0" w:after="140" w:line="280" w:lineRule="exact"/>
+        <w:spacing w:before="0" w:after="140" w:line="320" w:lineRule="exact"/>
         <w:keepLines/>
         <w:snapToGrid w:val="0"/>
         <w:ind w:left="280" w:hanging="280"/>
@@ -1403,8 +1617,8 @@
       <w:r>
         <w:rPr>
           <w:rFonts w:cs="Calibri"/>
-          <w:sz w:val="21"/>
-          <w:szCs w:val="21"/>
+          <w:sz w:val="22"/>
+          <w:szCs w:val="22"/>
           <w:color w:val="000000"/>
         </w:rPr>
         <w:t xml:space="preserve">•</w:t>
@@ -1413,8 +1627,8 @@
       <w:r>
         <w:rPr>
           <w:rFonts w:cs="Calibri"/>
-          <w:sz w:val="21"/>
-          <w:szCs w:val="21"/>
+          <w:sz w:val="22"/>
+          <w:szCs w:val="22"/>
           <w:color w:val="000000"/>
         </w:rPr>
         <w:t xml:space="preserve">Developed reusable Shiny modules and R scripts for interactive exploration of RNA-seq datasets during MSc study at the University of Edinburgh.</w:t>
@@ -1428,7 +1642,7 @@
           <w:color w:val="000000" w:themeColor="text1"/>
           <w:szCs w:val="21"/>
         </w:rPr>
-        <w:spacing w:before="60" w:after="40" w:line="280" w:lineRule="exact"/>
+        <w:spacing w:before="60" w:after="40" w:line="320" w:lineRule="exact"/>
         <w:keepLines/>
         <w:snapToGrid w:val="0"/>
         <w:keepNext/>
@@ -1436,8 +1650,8 @@
       <w:r>
         <w:rPr>
           <w:rFonts w:cs="Calibri"/>
-          <w:sz w:val="21"/>
-          <w:szCs w:val="21"/>
+          <w:sz w:val="22"/>
+          <w:szCs w:val="22"/>
           <w:color w:val="000000"/>
           <w:b/>
         </w:rPr>
@@ -1452,7 +1666,7 @@
           <w:color w:val="000000" w:themeColor="text1"/>
           <w:szCs w:val="21"/>
         </w:rPr>
-        <w:spacing w:before="0" w:after="40" w:line="280" w:lineRule="exact"/>
+        <w:spacing w:before="0" w:after="40" w:line="320" w:lineRule="exact"/>
         <w:keepLines/>
         <w:snapToGrid w:val="0"/>
         <w:keepNext/>
@@ -1460,8 +1674,8 @@
       <w:r>
         <w:rPr>
           <w:rFonts w:cs="Calibri"/>
-          <w:sz w:val="21"/>
-          <w:szCs w:val="21"/>
+          <w:sz w:val="22"/>
+          <w:szCs w:val="22"/>
           <w:color w:val="000000"/>
         </w:rPr>
         <w:t xml:space="preserve">May 2020 – May 2021</w:t>
@@ -1475,7 +1689,7 @@
           <w:color w:val="000000" w:themeColor="text1"/>
           <w:szCs w:val="21"/>
         </w:rPr>
-        <w:spacing w:before="0" w:after="120" w:line="280" w:lineRule="exact"/>
+        <w:spacing w:before="0" w:after="120" w:line="320" w:lineRule="exact"/>
         <w:keepLines/>
         <w:snapToGrid w:val="0"/>
         <w:ind w:left="280" w:hanging="280"/>
@@ -1483,8 +1697,8 @@
       <w:r>
         <w:rPr>
           <w:rFonts w:cs="Calibri"/>
-          <w:sz w:val="21"/>
-          <w:szCs w:val="21"/>
+          <w:sz w:val="22"/>
+          <w:szCs w:val="22"/>
           <w:color w:val="000000"/>
         </w:rPr>
         <w:t xml:space="preserve">•</w:t>
@@ -1493,8 +1707,8 @@
       <w:r>
         <w:rPr>
           <w:rFonts w:cs="Calibri"/>
-          <w:sz w:val="21"/>
-          <w:szCs w:val="21"/>
+          <w:sz w:val="22"/>
+          <w:szCs w:val="22"/>
           <w:color w:val="000000"/>
         </w:rPr>
         <w:t xml:space="preserve">Contributed to sex-hormone immunoassay reagent development and an inhibin A (INH-A) project.</w:t>
@@ -1526,26 +1740,90 @@
           <w:b/>
           <w:highlight w:val="lightGray"/>
         </w:rPr>
-        <w:t xml:space="preserve">DATA ANALYSIS SKILLS</w:t>
-      </w:r>
-    </w:p>
-    <w:p>
-      <w:pPr>
-        <w:rPr>
-          <w:rFonts w:cs="Calibri"/>
-          <w:bCs/>
-          <w:color w:val="000000" w:themeColor="text1"/>
-          <w:szCs w:val="21"/>
-        </w:rPr>
-        <w:spacing w:before="0" w:after="80" w:line="280" w:lineRule="exact"/>
-        <w:keepLines/>
-        <w:snapToGrid w:val="0"/>
-      </w:pPr>
-      <w:r>
-        <w:rPr>
-          <w:rFonts w:cs="Calibri"/>
-          <w:sz w:val="21"/>
-          <w:szCs w:val="21"/>
+        <w:t xml:space="preserve">AI AND COMPUTATIONAL SKILLS</w:t>
+      </w:r>
+    </w:p>
+    <w:p>
+      <w:pPr>
+        <w:rPr>
+          <w:rFonts w:cs="Calibri"/>
+          <w:bCs/>
+          <w:color w:val="000000" w:themeColor="text1"/>
+          <w:szCs w:val="21"/>
+        </w:rPr>
+        <w:spacing w:before="0" w:after="80" w:line="320" w:lineRule="exact"/>
+        <w:keepLines/>
+        <w:snapToGrid w:val="0"/>
+      </w:pPr>
+      <w:r>
+        <w:rPr>
+          <w:rFonts w:cs="Calibri"/>
+          <w:sz w:val="22"/>
+          <w:szCs w:val="22"/>
+          <w:color w:val="000000"/>
+          <w:b/>
+        </w:rPr>
+        <w:t xml:space="preserve">AI and foundation models: </w:t>
+      </w:r>
+      <w:r>
+        <w:rPr>
+          <w:rFonts w:cs="Calibri"/>
+          <w:sz w:val="22"/>
+          <w:szCs w:val="22"/>
+          <w:color w:val="000000"/>
+        </w:rPr>
+        <w:t xml:space="preserve">Nucleotide foundation-model benchmarking; protein language models; biological sequence representations.</w:t>
+      </w:r>
+    </w:p>
+    <w:p>
+      <w:pPr>
+        <w:rPr>
+          <w:rFonts w:cs="Calibri"/>
+          <w:bCs/>
+          <w:color w:val="000000" w:themeColor="text1"/>
+          <w:szCs w:val="21"/>
+        </w:rPr>
+        <w:spacing w:before="0" w:after="80" w:line="320" w:lineRule="exact"/>
+        <w:keepLines/>
+        <w:snapToGrid w:val="0"/>
+      </w:pPr>
+      <w:r>
+        <w:rPr>
+          <w:rFonts w:cs="Calibri"/>
+          <w:sz w:val="22"/>
+          <w:szCs w:val="22"/>
+          <w:color w:val="000000"/>
+          <w:b/>
+        </w:rPr>
+        <w:t xml:space="preserve">Deep learning: </w:t>
+      </w:r>
+      <w:r>
+        <w:rPr>
+          <w:rFonts w:cs="Calibri"/>
+          <w:sz w:val="22"/>
+          <w:szCs w:val="22"/>
+          <w:color w:val="000000"/>
+        </w:rPr>
+        <w:t xml:space="preserve">Model development, training, evaluation, benchmarking and interpretation.</w:t>
+      </w:r>
+    </w:p>
+    <w:p>
+      <w:pPr>
+        <w:rPr>
+          <w:rFonts w:cs="Calibri"/>
+          <w:bCs/>
+          <w:color w:val="000000" w:themeColor="text1"/>
+          <w:szCs w:val="21"/>
+        </w:rPr>
+        <w:spacing w:before="0" w:after="80" w:line="320" w:lineRule="exact"/>
+        <w:keepLines/>
+        <w:snapToGrid w:val="0"/>
+      </w:pPr>
+      <w:r>
+        <w:rPr>
+          <w:rFonts w:cs="Calibri"/>
+          <w:sz w:val="22"/>
+          <w:szCs w:val="22"/>
           <w:color w:val="000000"/>
           <w:b/>
         </w:rPr>
@@ -1554,107 +1832,43 @@
       <w:r>
         <w:rPr>
           <w:rFonts w:cs="Calibri"/>
-          <w:sz w:val="21"/>
-          <w:szCs w:val="21"/>
-          <w:color w:val="000000"/>
-        </w:rPr>
-        <w:t xml:space="preserve">R, Python, Linux, Shell, Docker, SQL</w:t>
-      </w:r>
-    </w:p>
-    <w:p>
-      <w:pPr>
-        <w:rPr>
-          <w:rFonts w:cs="Calibri"/>
-          <w:bCs/>
-          <w:color w:val="000000" w:themeColor="text1"/>
-          <w:szCs w:val="21"/>
-        </w:rPr>
-        <w:spacing w:before="0" w:after="80" w:line="280" w:lineRule="exact"/>
-        <w:keepLines/>
-        <w:snapToGrid w:val="0"/>
-      </w:pPr>
-      <w:r>
-        <w:rPr>
-          <w:rFonts w:cs="Calibri"/>
-          <w:sz w:val="21"/>
-          <w:szCs w:val="21"/>
-          <w:color w:val="000000"/>
-          <w:b/>
-        </w:rPr>
-        <w:t xml:space="preserve">Genomic data analysis: </w:t>
-      </w:r>
-      <w:r>
-        <w:rPr>
-          <w:rFonts w:cs="Calibri"/>
-          <w:sz w:val="21"/>
-          <w:szCs w:val="21"/>
-          <w:color w:val="000000"/>
-        </w:rPr>
-        <w:t xml:space="preserve">RNA-seq, single-cell RNA-seq, whole-genome sequencing, copy-number analysis and workflow development</w:t>
-      </w:r>
-    </w:p>
-    <w:p>
-      <w:pPr>
-        <w:rPr>
-          <w:rFonts w:cs="Calibri"/>
-          <w:bCs/>
-          <w:color w:val="000000" w:themeColor="text1"/>
-          <w:szCs w:val="21"/>
-        </w:rPr>
-        <w:spacing w:before="0" w:after="80" w:line="280" w:lineRule="exact"/>
-        <w:keepLines/>
-        <w:snapToGrid w:val="0"/>
-      </w:pPr>
-      <w:r>
-        <w:rPr>
-          <w:rFonts w:cs="Calibri"/>
-          <w:sz w:val="21"/>
-          <w:szCs w:val="21"/>
-          <w:color w:val="000000"/>
-          <w:b/>
-        </w:rPr>
-        <w:t xml:space="preserve">Evolution and modelling: </w:t>
-      </w:r>
-      <w:r>
-        <w:rPr>
-          <w:rFonts w:cs="Calibri"/>
-          <w:sz w:val="21"/>
-          <w:szCs w:val="21"/>
-          <w:color w:val="000000"/>
-        </w:rPr>
-        <w:t xml:space="preserve">Phylogenetics, BEAST, Nextstrain, statistical analysis and deep learning</w:t>
-      </w:r>
-    </w:p>
-    <w:p>
-      <w:pPr>
-        <w:rPr>
-          <w:rFonts w:cs="Calibri"/>
-          <w:bCs/>
-          <w:color w:val="000000" w:themeColor="text1"/>
-          <w:szCs w:val="21"/>
-        </w:rPr>
-        <w:spacing w:before="0" w:after="80" w:line="280" w:lineRule="exact"/>
-        <w:keepLines/>
-        <w:snapToGrid w:val="0"/>
-      </w:pPr>
-      <w:r>
-        <w:rPr>
-          <w:rFonts w:cs="Calibri"/>
-          <w:sz w:val="21"/>
-          <w:szCs w:val="21"/>
-          <w:color w:val="000000"/>
-          <w:b/>
-        </w:rPr>
-        <w:t xml:space="preserve">Visualisation and tools: </w:t>
-      </w:r>
-      <w:r>
-        <w:rPr>
-          <w:rFonts w:cs="Calibri"/>
-          <w:sz w:val="21"/>
-          <w:szCs w:val="21"/>
-          <w:color w:val="000000"/>
-        </w:rPr>
-        <w:t xml:space="preserve">R Shiny, interactive data exploration and scientific visualisation</w:t>
+          <w:sz w:val="22"/>
+          <w:szCs w:val="22"/>
+          <w:color w:val="000000"/>
+        </w:rPr>
+        <w:t xml:space="preserve">R, Python, Linux, Shell, Docker, SQL.</w:t>
+      </w:r>
+    </w:p>
+    <w:p>
+      <w:pPr>
+        <w:rPr>
+          <w:rFonts w:cs="Calibri"/>
+          <w:bCs/>
+          <w:color w:val="000000" w:themeColor="text1"/>
+          <w:szCs w:val="21"/>
+        </w:rPr>
+        <w:spacing w:before="0" w:after="80" w:line="320" w:lineRule="exact"/>
+        <w:keepLines/>
+        <w:snapToGrid w:val="0"/>
+      </w:pPr>
+      <w:r>
+        <w:rPr>
+          <w:rFonts w:cs="Calibri"/>
+          <w:sz w:val="22"/>
+          <w:szCs w:val="22"/>
+          <w:color w:val="000000"/>
+          <w:b/>
+        </w:rPr>
+        <w:t xml:space="preserve">Bioinformatics: </w:t>
+      </w:r>
+      <w:r>
+        <w:rPr>
+          <w:rFonts w:cs="Calibri"/>
+          <w:sz w:val="22"/>
+          <w:szCs w:val="22"/>
+          <w:color w:val="000000"/>
+        </w:rPr>
+        <w:t xml:space="preserve">Phylogenetics, BEAST, Nextstrain, RNA-seq, single-cell RNA-seq, WGS and copy-number analysis.</w:t>
       </w:r>
     </w:p>
     <w:p>
@@ -1694,15 +1908,15 @@
           <w:color w:val="000000" w:themeColor="text1"/>
           <w:szCs w:val="21"/>
         </w:rPr>
-        <w:spacing w:before="0" w:after="60" w:line="280" w:lineRule="exact"/>
-        <w:keepLines/>
-        <w:snapToGrid w:val="0"/>
-      </w:pPr>
-      <w:r>
-        <w:rPr>
-          <w:rFonts w:cs="Calibri"/>
-          <w:sz w:val="21"/>
-          <w:szCs w:val="21"/>
+        <w:spacing w:before="0" w:after="60" w:line="320" w:lineRule="exact"/>
+        <w:keepLines/>
+        <w:snapToGrid w:val="0"/>
+      </w:pPr>
+      <w:r>
+        <w:rPr>
+          <w:rFonts w:cs="Calibri"/>
+          <w:sz w:val="22"/>
+          <w:szCs w:val="22"/>
           <w:color w:val="000000"/>
           <w:b/>
         </w:rPr>
@@ -1717,15 +1931,15 @@
           <w:color w:val="000000" w:themeColor="text1"/>
           <w:szCs w:val="21"/>
         </w:rPr>
-        <w:spacing w:before="0" w:after="100" w:line="280" w:lineRule="exact"/>
-        <w:keepLines/>
-        <w:snapToGrid w:val="0"/>
-      </w:pPr>
-      <w:r>
-        <w:rPr>
-          <w:rFonts w:cs="Calibri"/>
-          <w:sz w:val="21"/>
-          <w:szCs w:val="21"/>
+        <w:spacing w:before="0" w:after="100" w:line="320" w:lineRule="exact"/>
+        <w:keepLines/>
+        <w:snapToGrid w:val="0"/>
+      </w:pPr>
+      <w:r>
+        <w:rPr>
+          <w:rFonts w:cs="Calibri"/>
+          <w:sz w:val="22"/>
+          <w:szCs w:val="22"/>
           <w:color w:val="000000"/>
         </w:rPr>
         <w:t xml:space="preserve">Single-cell RNA-seq workflows · RNA-seq molecular subtyping · R Shiny tools</w:t>

</xml_diff>

<commit_message>
Correct CRM journal name to Cell Reports Methods
</commit_message>
<xml_diff>
--- a/uploads/Shu_Hu_CV_EN.docx
+++ b/uploads/Shu_Hu_CV_EN.docx
@@ -455,7 +455,7 @@
           <w:color w:val="000000"/>
           <w:i/>
         </w:rPr>
-        <w:t xml:space="preserve">Cell Reports Medicine</w:t>
+        <w:t xml:space="preserve">Cell Reports Methods</w:t>
       </w:r>
       <w:r>
         <w:rPr>
@@ -1211,7 +1211,7 @@
           <w:szCs w:val="22"/>
           <w:color w:val="000000"/>
         </w:rPr>
-        <w:t xml:space="preserve">Co-developed the UniCAV model and training framework; curated datasets, conducted computational analyses and benchmarks, and drafted the manuscript (co-first author; Cell Reports Medicine, under revision).</w:t>
+        <w:t xml:space="preserve">Co-developed the UniCAV model and training framework; curated datasets, conducted computational analyses and benchmarks, and drafted the manuscript (co-first author; Cell Reports Methods, under revision).</w:t>
       </w:r>
     </w:p>
     <w:p>

</xml_diff>

<commit_message>
Unify CV experience layout and simplify skills heading
</commit_message>
<xml_diff>
--- a/uploads/Shu_Hu_CV_EN.docx
+++ b/uploads/Shu_Hu_CV_EN.docx
@@ -1151,7 +1151,7 @@
           <w:color w:val="000000" w:themeColor="text1"/>
           <w:szCs w:val="21"/>
         </w:rPr>
-        <w:spacing w:before="0" w:after="40" w:line="320" w:lineRule="exact"/>
+        <w:spacing w:before="0" w:after="0" w:line="320" w:lineRule="exact"/>
         <w:keepLines/>
         <w:snapToGrid w:val="0"/>
         <w:keepNext/>
@@ -1167,7 +1167,7 @@
           <w:color w:val="000000"/>
           <w:b/>
         </w:rPr>
-        <w:t xml:space="preserve">Fudan University | PhD Research</w:t>
+        <w:t xml:space="preserve">Fudan University</w:t>
       </w:r>
       <w:r>
         <w:rPr>
@@ -1189,6 +1189,29 @@
           <w:color w:val="000000" w:themeColor="text1"/>
           <w:szCs w:val="21"/>
         </w:rPr>
+        <w:spacing w:before="0" w:after="60" w:line="320" w:lineRule="exact"/>
+        <w:keepLines/>
+        <w:snapToGrid w:val="0"/>
+        <w:keepNext/>
+      </w:pPr>
+      <w:r>
+        <w:rPr>
+          <w:rFonts w:cs="Calibri"/>
+          <w:sz w:val="22"/>
+          <w:szCs w:val="22"/>
+          <w:color w:val="000000"/>
+        </w:rPr>
+        <w:t xml:space="preserve">PhD Research</w:t>
+      </w:r>
+    </w:p>
+    <w:p>
+      <w:pPr>
+        <w:rPr>
+          <w:rFonts w:cs="Calibri"/>
+          <w:bCs/>
+          <w:color w:val="000000" w:themeColor="text1"/>
+          <w:szCs w:val="21"/>
+        </w:rPr>
         <w:spacing w:before="0" w:after="80" w:line="320" w:lineRule="exact"/>
         <w:keepLines/>
         <w:snapToGrid w:val="0"/>
@@ -1255,7 +1278,7 @@
           <w:color w:val="000000" w:themeColor="text1"/>
           <w:szCs w:val="21"/>
         </w:rPr>
-        <w:spacing w:before="0" w:after="40" w:line="320" w:lineRule="exact"/>
+        <w:spacing w:before="0" w:after="0" w:line="320" w:lineRule="exact"/>
         <w:keepLines/>
         <w:snapToGrid w:val="0"/>
         <w:keepNext/>
@@ -1271,7 +1294,7 @@
           <w:color w:val="000000"/>
           <w:b/>
         </w:rPr>
-        <w:t xml:space="preserve">The University of Hong Kong | Research Assistant I</w:t>
+        <w:t xml:space="preserve">The University of Hong Kong</w:t>
       </w:r>
       <w:r>
         <w:rPr>
@@ -1293,6 +1316,29 @@
           <w:color w:val="000000" w:themeColor="text1"/>
           <w:szCs w:val="21"/>
         </w:rPr>
+        <w:spacing w:before="0" w:after="60" w:line="320" w:lineRule="exact"/>
+        <w:keepLines/>
+        <w:snapToGrid w:val="0"/>
+        <w:keepNext/>
+      </w:pPr>
+      <w:r>
+        <w:rPr>
+          <w:rFonts w:cs="Calibri"/>
+          <w:sz w:val="22"/>
+          <w:szCs w:val="22"/>
+          <w:color w:val="000000"/>
+        </w:rPr>
+        <w:t xml:space="preserve">Research Assistant I</w:t>
+      </w:r>
+    </w:p>
+    <w:p>
+      <w:pPr>
+        <w:rPr>
+          <w:rFonts w:cs="Calibri"/>
+          <w:bCs/>
+          <w:color w:val="000000" w:themeColor="text1"/>
+          <w:szCs w:val="21"/>
+        </w:rPr>
         <w:spacing w:before="0" w:after="80" w:line="320" w:lineRule="exact"/>
         <w:keepLines/>
         <w:snapToGrid w:val="0"/>
@@ -1392,186 +1438,7 @@
           <w:color w:val="000000" w:themeColor="text1"/>
           <w:szCs w:val="21"/>
         </w:rPr>
-        <w:spacing w:before="80" w:after="40" w:line="320" w:lineRule="exact"/>
-        <w:keepLines/>
-        <w:snapToGrid w:val="0"/>
-        <w:keepNext/>
-      </w:pPr>
-      <w:r>
-        <w:rPr>
-          <w:rFonts w:cs="Calibri"/>
-          <w:sz w:val="22"/>
-          <w:szCs w:val="22"/>
-          <w:color w:val="000000"/>
-          <w:b/>
-        </w:rPr>
-        <w:t xml:space="preserve">Shanghai Rightongene Technology Co., Ltd. | Bioinformatics Engineer</w:t>
-      </w:r>
-    </w:p>
-    <w:p>
-      <w:pPr>
-        <w:rPr>
-          <w:rFonts w:cs="Calibri"/>
-          <w:bCs/>
-          <w:color w:val="000000" w:themeColor="text1"/>
-          <w:szCs w:val="21"/>
-        </w:rPr>
-        <w:spacing w:before="0" w:after="80" w:line="320" w:lineRule="exact"/>
-        <w:keepLines/>
-        <w:snapToGrid w:val="0"/>
-        <w:keepNext/>
-      </w:pPr>
-      <w:r>
-        <w:rPr>
-          <w:rFonts w:cs="Calibri"/>
-          <w:sz w:val="22"/>
-          <w:szCs w:val="22"/>
-          <w:color w:val="000000"/>
-        </w:rPr>
-        <w:t xml:space="preserve">2024 – May 2025; Sep 2022 – May 2023</w:t>
-      </w:r>
-    </w:p>
-    <w:p>
-      <w:pPr>
-        <w:rPr>
-          <w:rFonts w:cs="Calibri"/>
-          <w:bCs/>
-          <w:color w:val="000000" w:themeColor="text1"/>
-          <w:szCs w:val="21"/>
-        </w:rPr>
-        <w:spacing w:before="0" w:after="80" w:line="320" w:lineRule="exact"/>
-        <w:keepLines/>
-        <w:snapToGrid w:val="0"/>
-        <w:ind w:left="280" w:hanging="280"/>
-      </w:pPr>
-      <w:r>
-        <w:rPr>
-          <w:rFonts w:cs="Calibri"/>
-          <w:sz w:val="22"/>
-          <w:szCs w:val="22"/>
-          <w:color w:val="000000"/>
-        </w:rPr>
-        <w:t xml:space="preserve">•</w:t>
-        <w:tab/>
-      </w:r>
-      <w:r>
-        <w:rPr>
-          <w:rFonts w:cs="Calibri"/>
-          <w:sz w:val="22"/>
-          <w:szCs w:val="22"/>
-          <w:color w:val="000000"/>
-        </w:rPr>
-        <w:t xml:space="preserve">Developed analysis methods for BCL6, BCL2 and MYC gene fusions in DLBCL sequencing workflows, addressing discrepancies between NGS and FISH results.</w:t>
-      </w:r>
-    </w:p>
-    <w:p>
-      <w:pPr>
-        <w:rPr>
-          <w:rFonts w:cs="Calibri"/>
-          <w:bCs/>
-          <w:color w:val="000000" w:themeColor="text1"/>
-          <w:szCs w:val="21"/>
-        </w:rPr>
-        <w:spacing w:before="0" w:after="80" w:line="320" w:lineRule="exact"/>
-        <w:keepLines/>
-        <w:snapToGrid w:val="0"/>
-        <w:ind w:left="280" w:hanging="280"/>
-      </w:pPr>
-      <w:r>
-        <w:rPr>
-          <w:rFonts w:cs="Calibri"/>
-          <w:sz w:val="22"/>
-          <w:szCs w:val="22"/>
-          <w:color w:val="000000"/>
-        </w:rPr>
-        <w:t xml:space="preserve">•</w:t>
-        <w:tab/>
-      </w:r>
-      <w:r>
-        <w:rPr>
-          <w:rFonts w:cs="Calibri"/>
-          <w:sz w:val="22"/>
-          <w:szCs w:val="22"/>
-          <w:color w:val="000000"/>
-        </w:rPr>
-        <w:t xml:space="preserve">Established low-depth whole-genome sequencing workflows for copy-number analysis using QDNAseq, Control-FREEC and ichorCNA.</w:t>
-      </w:r>
-    </w:p>
-    <w:p>
-      <w:pPr>
-        <w:rPr>
-          <w:rFonts w:cs="Calibri"/>
-          <w:bCs/>
-          <w:color w:val="000000" w:themeColor="text1"/>
-          <w:szCs w:val="21"/>
-        </w:rPr>
-        <w:spacing w:before="0" w:after="80" w:line="320" w:lineRule="exact"/>
-        <w:keepLines/>
-        <w:snapToGrid w:val="0"/>
-        <w:ind w:left="280" w:hanging="280"/>
-      </w:pPr>
-      <w:r>
-        <w:rPr>
-          <w:rFonts w:cs="Calibri"/>
-          <w:sz w:val="22"/>
-          <w:szCs w:val="22"/>
-          <w:color w:val="000000"/>
-        </w:rPr>
-        <w:t xml:space="preserve">•</w:t>
-        <w:tab/>
-      </w:r>
-      <w:r>
-        <w:rPr>
-          <w:rFonts w:cs="Calibri"/>
-          <w:sz w:val="22"/>
-          <w:szCs w:val="22"/>
-          <w:color w:val="000000"/>
-        </w:rPr>
-        <w:t xml:space="preserve">Built upstream and downstream single-cell RNA-seq workflows and collaborated with IT colleagues to deploy analyses on an automated platform.</w:t>
-      </w:r>
-    </w:p>
-    <w:p>
-      <w:pPr>
-        <w:rPr>
-          <w:rFonts w:cs="Calibri"/>
-          <w:bCs/>
-          <w:color w:val="000000" w:themeColor="text1"/>
-          <w:szCs w:val="21"/>
-        </w:rPr>
-        <w:spacing w:before="0" w:after="80" w:line="320" w:lineRule="exact"/>
-        <w:keepLines/>
-        <w:snapToGrid w:val="0"/>
-        <w:ind w:left="280" w:hanging="280"/>
-      </w:pPr>
-      <w:r>
-        <w:rPr>
-          <w:rFonts w:cs="Calibri"/>
-          <w:sz w:val="22"/>
-          <w:szCs w:val="22"/>
-          <w:color w:val="000000"/>
-        </w:rPr>
-        <w:t xml:space="preserve">•</w:t>
-        <w:tab/>
-      </w:r>
-      <w:r>
-        <w:rPr>
-          <w:rFonts w:cs="Calibri"/>
-          <w:sz w:val="22"/>
-          <w:szCs w:val="22"/>
-          <w:color w:val="000000"/>
-        </w:rPr>
-        <w:t xml:space="preserve">Developed RNA-seq expression-based models for leukemia molecular subtyping.</w:t>
-      </w:r>
-    </w:p>
-    <w:p>
-      <w:pPr>
-        <w:rPr>
-          <w:rFonts w:cs="Calibri"/>
-          <w:bCs/>
-          <w:color w:val="000000" w:themeColor="text1"/>
-          <w:szCs w:val="21"/>
-        </w:rPr>
-        <w:spacing w:before="100" w:after="40" w:line="320" w:lineRule="exact"/>
+        <w:spacing w:before="80" w:after="0" w:line="320" w:lineRule="exact"/>
         <w:keepLines/>
         <w:snapToGrid w:val="0"/>
         <w:keepNext/>
@@ -1587,7 +1454,200 @@
           <w:color w:val="000000"/>
           <w:b/>
         </w:rPr>
-        <w:t xml:space="preserve">The University of Edinburgh | MSc Research</w:t>
+        <w:t xml:space="preserve">Shanghai Rightongene Technology Co., Ltd.</w:t>
+      </w:r>
+      <w:r>
+        <w:rPr>
+          <w:rFonts w:cs="Calibri"/>
+          <w:sz w:val="22"/>
+          <w:szCs w:val="22"/>
+          <w:color w:val="000000"/>
+          <w:b/>
+        </w:rPr>
+        <w:tab/>
+        <w:t xml:space="preserve">2024 – May 2025; Sep 2022 – May 2023</w:t>
+      </w:r>
+    </w:p>
+    <w:p>
+      <w:pPr>
+        <w:rPr>
+          <w:rFonts w:cs="Calibri"/>
+          <w:bCs/>
+          <w:color w:val="000000" w:themeColor="text1"/>
+          <w:szCs w:val="21"/>
+        </w:rPr>
+        <w:spacing w:before="0" w:after="60" w:line="320" w:lineRule="exact"/>
+        <w:keepLines/>
+        <w:snapToGrid w:val="0"/>
+        <w:keepNext/>
+      </w:pPr>
+      <w:r>
+        <w:rPr>
+          <w:rFonts w:cs="Calibri"/>
+          <w:sz w:val="22"/>
+          <w:szCs w:val="22"/>
+          <w:color w:val="000000"/>
+        </w:rPr>
+        <w:t xml:space="preserve">Bioinformatics Engineer</w:t>
+      </w:r>
+    </w:p>
+    <w:p>
+      <w:pPr>
+        <w:rPr>
+          <w:rFonts w:cs="Calibri"/>
+          <w:bCs/>
+          <w:color w:val="000000" w:themeColor="text1"/>
+          <w:szCs w:val="21"/>
+        </w:rPr>
+        <w:spacing w:before="0" w:after="80" w:line="320" w:lineRule="exact"/>
+        <w:keepLines/>
+        <w:snapToGrid w:val="0"/>
+        <w:ind w:left="280" w:hanging="280"/>
+      </w:pPr>
+      <w:r>
+        <w:rPr>
+          <w:rFonts w:cs="Calibri"/>
+          <w:sz w:val="22"/>
+          <w:szCs w:val="22"/>
+          <w:color w:val="000000"/>
+        </w:rPr>
+        <w:t xml:space="preserve">•</w:t>
+        <w:tab/>
+      </w:r>
+      <w:r>
+        <w:rPr>
+          <w:rFonts w:cs="Calibri"/>
+          <w:sz w:val="22"/>
+          <w:szCs w:val="22"/>
+          <w:color w:val="000000"/>
+        </w:rPr>
+        <w:t xml:space="preserve">Developed analysis methods for BCL6, BCL2 and MYC gene fusions in DLBCL sequencing workflows, addressing discrepancies between NGS and FISH results.</w:t>
+      </w:r>
+    </w:p>
+    <w:p>
+      <w:pPr>
+        <w:rPr>
+          <w:rFonts w:cs="Calibri"/>
+          <w:bCs/>
+          <w:color w:val="000000" w:themeColor="text1"/>
+          <w:szCs w:val="21"/>
+        </w:rPr>
+        <w:spacing w:before="0" w:after="80" w:line="320" w:lineRule="exact"/>
+        <w:keepLines/>
+        <w:snapToGrid w:val="0"/>
+        <w:ind w:left="280" w:hanging="280"/>
+      </w:pPr>
+      <w:r>
+        <w:rPr>
+          <w:rFonts w:cs="Calibri"/>
+          <w:sz w:val="22"/>
+          <w:szCs w:val="22"/>
+          <w:color w:val="000000"/>
+        </w:rPr>
+        <w:t xml:space="preserve">•</w:t>
+        <w:tab/>
+      </w:r>
+      <w:r>
+        <w:rPr>
+          <w:rFonts w:cs="Calibri"/>
+          <w:sz w:val="22"/>
+          <w:szCs w:val="22"/>
+          <w:color w:val="000000"/>
+        </w:rPr>
+        <w:t xml:space="preserve">Established low-depth whole-genome sequencing workflows for copy-number analysis using QDNAseq, Control-FREEC and ichorCNA.</w:t>
+      </w:r>
+    </w:p>
+    <w:p>
+      <w:pPr>
+        <w:rPr>
+          <w:rFonts w:cs="Calibri"/>
+          <w:bCs/>
+          <w:color w:val="000000" w:themeColor="text1"/>
+          <w:szCs w:val="21"/>
+        </w:rPr>
+        <w:spacing w:before="0" w:after="80" w:line="320" w:lineRule="exact"/>
+        <w:keepLines/>
+        <w:snapToGrid w:val="0"/>
+        <w:ind w:left="280" w:hanging="280"/>
+      </w:pPr>
+      <w:r>
+        <w:rPr>
+          <w:rFonts w:cs="Calibri"/>
+          <w:sz w:val="22"/>
+          <w:szCs w:val="22"/>
+          <w:color w:val="000000"/>
+        </w:rPr>
+        <w:t xml:space="preserve">•</w:t>
+        <w:tab/>
+      </w:r>
+      <w:r>
+        <w:rPr>
+          <w:rFonts w:cs="Calibri"/>
+          <w:sz w:val="22"/>
+          <w:szCs w:val="22"/>
+          <w:color w:val="000000"/>
+        </w:rPr>
+        <w:t xml:space="preserve">Built upstream and downstream single-cell RNA-seq workflows and collaborated with IT colleagues to deploy analyses on an automated platform.</w:t>
+      </w:r>
+    </w:p>
+    <w:p>
+      <w:pPr>
+        <w:rPr>
+          <w:rFonts w:cs="Calibri"/>
+          <w:bCs/>
+          <w:color w:val="000000" w:themeColor="text1"/>
+          <w:szCs w:val="21"/>
+        </w:rPr>
+        <w:spacing w:before="0" w:after="80" w:line="320" w:lineRule="exact"/>
+        <w:keepLines/>
+        <w:snapToGrid w:val="0"/>
+        <w:ind w:left="280" w:hanging="280"/>
+      </w:pPr>
+      <w:r>
+        <w:rPr>
+          <w:rFonts w:cs="Calibri"/>
+          <w:sz w:val="22"/>
+          <w:szCs w:val="22"/>
+          <w:color w:val="000000"/>
+        </w:rPr>
+        <w:t xml:space="preserve">•</w:t>
+        <w:tab/>
+      </w:r>
+      <w:r>
+        <w:rPr>
+          <w:rFonts w:cs="Calibri"/>
+          <w:sz w:val="22"/>
+          <w:szCs w:val="22"/>
+          <w:color w:val="000000"/>
+        </w:rPr>
+        <w:t xml:space="preserve">Developed RNA-seq expression-based models for leukemia molecular subtyping.</w:t>
+      </w:r>
+    </w:p>
+    <w:p>
+      <w:pPr>
+        <w:rPr>
+          <w:rFonts w:cs="Calibri"/>
+          <w:bCs/>
+          <w:color w:val="000000" w:themeColor="text1"/>
+          <w:szCs w:val="21"/>
+        </w:rPr>
+        <w:spacing w:before="100" w:after="0" w:line="320" w:lineRule="exact"/>
+        <w:keepLines/>
+        <w:snapToGrid w:val="0"/>
+        <w:keepNext/>
+        <w:tabs>
+          <w:tab w:val="right" w:pos="10465"/>
+        </w:tabs>
+      </w:pPr>
+      <w:r>
+        <w:rPr>
+          <w:rFonts w:cs="Calibri"/>
+          <w:sz w:val="22"/>
+          <w:szCs w:val="22"/>
+          <w:color w:val="000000"/>
+          <w:b/>
+        </w:rPr>
+        <w:t xml:space="preserve">The University of Edinburgh</w:t>
       </w:r>
       <w:r>
         <w:rPr>
@@ -1609,6 +1669,29 @@
           <w:color w:val="000000" w:themeColor="text1"/>
           <w:szCs w:val="21"/>
         </w:rPr>
+        <w:spacing w:before="0" w:after="60" w:line="320" w:lineRule="exact"/>
+        <w:keepLines/>
+        <w:snapToGrid w:val="0"/>
+        <w:keepNext/>
+      </w:pPr>
+      <w:r>
+        <w:rPr>
+          <w:rFonts w:cs="Calibri"/>
+          <w:sz w:val="22"/>
+          <w:szCs w:val="22"/>
+          <w:color w:val="000000"/>
+        </w:rPr>
+        <w:t xml:space="preserve">MSc Research</w:t>
+      </w:r>
+    </w:p>
+    <w:p>
+      <w:pPr>
+        <w:rPr>
+          <w:rFonts w:cs="Calibri"/>
+          <w:bCs/>
+          <w:color w:val="000000" w:themeColor="text1"/>
+          <w:szCs w:val="21"/>
+        </w:rPr>
         <w:spacing w:before="0" w:after="140" w:line="320" w:lineRule="exact"/>
         <w:keepLines/>
         <w:snapToGrid w:val="0"/>
@@ -1642,31 +1725,45 @@
           <w:color w:val="000000" w:themeColor="text1"/>
           <w:szCs w:val="21"/>
         </w:rPr>
-        <w:spacing w:before="60" w:after="40" w:line="320" w:lineRule="exact"/>
+        <w:spacing w:before="60" w:after="0" w:line="320" w:lineRule="exact"/>
         <w:keepLines/>
         <w:snapToGrid w:val="0"/>
         <w:keepNext/>
-      </w:pPr>
-      <w:r>
-        <w:rPr>
-          <w:rFonts w:cs="Calibri"/>
-          <w:sz w:val="22"/>
-          <w:szCs w:val="22"/>
-          <w:color w:val="000000"/>
-          <w:b/>
-        </w:rPr>
-        <w:t xml:space="preserve">Sichuan WoWente Biotechnology Co., Ltd. | Reagent Developer</w:t>
-      </w:r>
-    </w:p>
-    <w:p>
-      <w:pPr>
-        <w:rPr>
-          <w:rFonts w:cs="Calibri"/>
-          <w:bCs/>
-          <w:color w:val="000000" w:themeColor="text1"/>
-          <w:szCs w:val="21"/>
-        </w:rPr>
-        <w:spacing w:before="0" w:after="40" w:line="320" w:lineRule="exact"/>
+        <w:tabs>
+          <w:tab w:val="right" w:pos="10465"/>
+        </w:tabs>
+      </w:pPr>
+      <w:r>
+        <w:rPr>
+          <w:rFonts w:cs="Calibri"/>
+          <w:sz w:val="22"/>
+          <w:szCs w:val="22"/>
+          <w:color w:val="000000"/>
+          <w:b/>
+        </w:rPr>
+        <w:t xml:space="preserve">Sichuan WoWente Biotechnology Co., Ltd.</w:t>
+      </w:r>
+      <w:r>
+        <w:rPr>
+          <w:rFonts w:cs="Calibri"/>
+          <w:sz w:val="22"/>
+          <w:szCs w:val="22"/>
+          <w:color w:val="000000"/>
+          <w:b/>
+        </w:rPr>
+        <w:tab/>
+        <w:t xml:space="preserve">May 2020 – May 2021</w:t>
+      </w:r>
+    </w:p>
+    <w:p>
+      <w:pPr>
+        <w:rPr>
+          <w:rFonts w:cs="Calibri"/>
+          <w:bCs/>
+          <w:color w:val="000000" w:themeColor="text1"/>
+          <w:szCs w:val="21"/>
+        </w:rPr>
+        <w:spacing w:before="0" w:after="60" w:line="320" w:lineRule="exact"/>
         <w:keepLines/>
         <w:snapToGrid w:val="0"/>
         <w:keepNext/>
@@ -1678,7 +1775,7 @@
           <w:szCs w:val="22"/>
           <w:color w:val="000000"/>
         </w:rPr>
-        <w:t xml:space="preserve">May 2020 – May 2021</w:t>
+        <w:t xml:space="preserve">Reagent Developer</w:t>
       </w:r>
     </w:p>
     <w:p>
@@ -1740,7 +1837,7 @@
           <w:b/>
           <w:highlight w:val="lightGray"/>
         </w:rPr>
-        <w:t xml:space="preserve">AI AND COMPUTATIONAL SKILLS</w:t>
+        <w:t xml:space="preserve">TECHNICAL SKILLS</w:t>
       </w:r>
     </w:p>
     <w:p>

</xml_diff>

<commit_message>
Update HKU dates and add UniCAV code link to academic profile
</commit_message>
<xml_diff>
--- a/uploads/Shu_Hu_CV_EN.docx
+++ b/uploads/Shu_Hu_CV_EN.docx
@@ -474,7 +474,7 @@
           <w:color w:val="000000"/>
           <w:b/>
         </w:rPr>
-        <w:t xml:space="preserve">Under revision · Co-first author</w:t>
+        <w:t xml:space="preserve">Under revision</w:t>
       </w:r>
     </w:p>
     <w:p>
@@ -1234,7 +1234,7 @@
           <w:szCs w:val="22"/>
           <w:color w:val="000000"/>
         </w:rPr>
-        <w:t xml:space="preserve">Co-developed the UniCAV model and training framework; curated datasets, conducted computational analyses and benchmarks, and drafted the manuscript (co-first author; Cell Reports Methods, under revision).</w:t>
+        <w:t xml:space="preserve">Co-developed the UniCAV model and training framework; curated datasets, conducted computational analyses and benchmarks, and drafted the manuscript (Cell Reports Methods, under revision).</w:t>
       </w:r>
     </w:p>
     <w:p>
@@ -1305,7 +1305,7 @@
           <w:b/>
         </w:rPr>
         <w:tab/>
-        <w:t xml:space="preserve">2023–2024</w:t>
+        <w:t xml:space="preserve">Jun 2023 – Jun 2024</w:t>
       </w:r>
     </w:p>
     <w:p>
@@ -2015,10 +2015,20 @@
           <w:sz w:val="22"/>
           <w:szCs w:val="22"/>
           <w:color w:val="000000"/>
-          <w:b/>
-        </w:rPr>
-        <w:t xml:space="preserve">github.com/hushuzuiniu</w:t>
-      </w:r>
+        </w:rPr>
+      </w:r>
+      <w:hyperlink r:id="rIdCV16">
+        <w:r>
+          <w:rPr>
+            <w:rFonts w:cs="Calibri"/>
+            <w:sz w:val="22"/>
+            <w:szCs w:val="22"/>
+            <w:color w:val="000000"/>
+            <w:b/>
+          </w:rPr>
+          <w:t xml:space="preserve">github.com/hushuzuiniu</w:t>
+        </w:r>
+      </w:hyperlink>
     </w:p>
     <w:p>
       <w:pPr>
@@ -2039,7 +2049,26 @@
           <w:szCs w:val="22"/>
           <w:color w:val="000000"/>
         </w:rPr>
-        <w:t xml:space="preserve">Single-cell RNA-seq workflows · RNA-seq molecular subtyping · R Shiny tools</w:t>
+      </w:r>
+      <w:hyperlink r:id="rIdCV17">
+        <w:r>
+          <w:rPr>
+            <w:rFonts w:cs="Calibri"/>
+            <w:sz w:val="22"/>
+            <w:szCs w:val="22"/>
+            <w:color w:val="0000FF"/>
+          </w:rPr>
+          <w:t xml:space="preserve">UniCAV</w:t>
+        </w:r>
+      </w:hyperlink>
+      <w:r>
+        <w:rPr>
+          <w:rFonts w:cs="Calibri"/>
+          <w:sz w:val="22"/>
+          <w:szCs w:val="22"/>
+          <w:color w:val="000000"/>
+        </w:rPr>
+        <w:t xml:space="preserve"> · Single-cell RNA-seq workflows · RNA-seq molecular subtyping · R Shiny tools</w:t>
       </w:r>
     </w:p>
     <w:sectPr>

</xml_diff>

<commit_message>
Make all research software entries consistent clickable links
</commit_message>
<xml_diff>
--- a/uploads/Shu_Hu_CV_EN.docx
+++ b/uploads/Shu_Hu_CV_EN.docx
@@ -2023,7 +2023,7 @@
             <w:rFonts w:cs="Calibri"/>
             <w:sz w:val="22"/>
             <w:szCs w:val="22"/>
-            <w:color w:val="000000"/>
+            <w:color w:val="0000FF"/>
             <w:b/>
           </w:rPr>
           <w:t xml:space="preserve">github.com/hushuzuiniu</w:t>
@@ -2068,8 +2068,59 @@
           <w:szCs w:val="22"/>
           <w:color w:val="000000"/>
         </w:rPr>
-        <w:t xml:space="preserve"> · Single-cell RNA-seq workflows · RNA-seq molecular subtyping · R Shiny tools</w:t>
-      </w:r>
+        <w:t xml:space="preserve"> · </w:t>
+      </w:r>
+      <w:hyperlink r:id="rIdCV18">
+        <w:r>
+          <w:rPr>
+            <w:rFonts w:cs="Calibri"/>
+            <w:sz w:val="22"/>
+            <w:szCs w:val="22"/>
+            <w:color w:val="0000FF"/>
+          </w:rPr>
+          <w:t xml:space="preserve">Single-cell RNA-seq workflows</w:t>
+        </w:r>
+      </w:hyperlink>
+      <w:r>
+        <w:rPr>
+          <w:rFonts w:cs="Calibri"/>
+          <w:sz w:val="22"/>
+          <w:szCs w:val="22"/>
+          <w:color w:val="000000"/>
+        </w:rPr>
+        <w:t xml:space="preserve"> · </w:t>
+      </w:r>
+      <w:hyperlink r:id="rIdCV19">
+        <w:r>
+          <w:rPr>
+            <w:rFonts w:cs="Calibri"/>
+            <w:sz w:val="22"/>
+            <w:szCs w:val="22"/>
+            <w:color w:val="0000FF"/>
+          </w:rPr>
+          <w:t xml:space="preserve">RNA-seq molecular subtyping</w:t>
+        </w:r>
+      </w:hyperlink>
+      <w:r>
+        <w:rPr>
+          <w:rFonts w:cs="Calibri"/>
+          <w:sz w:val="22"/>
+          <w:szCs w:val="22"/>
+          <w:color w:val="000000"/>
+        </w:rPr>
+        <w:t xml:space="preserve"> · </w:t>
+      </w:r>
+      <w:hyperlink r:id="rIdCV20">
+        <w:r>
+          <w:rPr>
+            <w:rFonts w:cs="Calibri"/>
+            <w:sz w:val="22"/>
+            <w:szCs w:val="22"/>
+            <w:color w:val="0000FF"/>
+          </w:rPr>
+          <w:t xml:space="preserve">R Shiny tools</w:t>
+        </w:r>
+      </w:hyperlink>
     </w:p>
     <w:sectPr>
       <w:pgSz w:w="11906" w:h="16838"/>

</xml_diff>

<commit_message>
Expand research projects and correct publication authorship
</commit_message>
<xml_diff>
--- a/uploads/Shu_Hu_CV_EN.docx
+++ b/uploads/Shu_Hu_CV_EN.docx
@@ -598,7 +598,7 @@
           <w:szCs w:val="22"/>
           <w:color w:val="000000"/>
         </w:rPr>
-        <w:t xml:space="preserve">Schwab LSU, Xie R, Reilly E, Aban M, Spirason N, Deng YM, </w:t>
+        <w:t xml:space="preserve">Schwab LSU, Xie R, Reilly E, Aban M, </w:t>
       </w:r>
       <w:r>
         <w:rPr>
@@ -617,7 +617,7 @@
           <w:szCs w:val="22"/>
           <w:color w:val="000000"/>
         </w:rPr>
-        <w:t xml:space="preserve">, et al</w:t>
+        <w:t xml:space="preserve">, Spirason N, Deng YM, et al</w:t>
       </w:r>
       <w:r>
         <w:rPr>
@@ -2049,78 +2049,8 @@
           <w:szCs w:val="22"/>
           <w:color w:val="000000"/>
         </w:rPr>
-      </w:r>
-      <w:hyperlink r:id="rIdCV17">
-        <w:r>
-          <w:rPr>
-            <w:rFonts w:cs="Calibri"/>
-            <w:sz w:val="22"/>
-            <w:szCs w:val="22"/>
-            <w:color w:val="0000FF"/>
-          </w:rPr>
-          <w:t xml:space="preserve">UniCAV</w:t>
-        </w:r>
-      </w:hyperlink>
-      <w:r>
-        <w:rPr>
-          <w:rFonts w:cs="Calibri"/>
-          <w:sz w:val="22"/>
-          <w:szCs w:val="22"/>
-          <w:color w:val="000000"/>
-        </w:rPr>
-        <w:t xml:space="preserve"> · </w:t>
-      </w:r>
-      <w:hyperlink r:id="rIdCV18">
-        <w:r>
-          <w:rPr>
-            <w:rFonts w:cs="Calibri"/>
-            <w:sz w:val="22"/>
-            <w:szCs w:val="22"/>
-            <w:color w:val="0000FF"/>
-          </w:rPr>
-          <w:t xml:space="preserve">Single-cell RNA-seq workflows</w:t>
-        </w:r>
-      </w:hyperlink>
-      <w:r>
-        <w:rPr>
-          <w:rFonts w:cs="Calibri"/>
-          <w:sz w:val="22"/>
-          <w:szCs w:val="22"/>
-          <w:color w:val="000000"/>
-        </w:rPr>
-        <w:t xml:space="preserve"> · </w:t>
-      </w:r>
-      <w:hyperlink r:id="rIdCV19">
-        <w:r>
-          <w:rPr>
-            <w:rFonts w:cs="Calibri"/>
-            <w:sz w:val="22"/>
-            <w:szCs w:val="22"/>
-            <w:color w:val="0000FF"/>
-          </w:rPr>
-          <w:t xml:space="preserve">RNA-seq molecular subtyping</w:t>
-        </w:r>
-      </w:hyperlink>
-      <w:r>
-        <w:rPr>
-          <w:rFonts w:cs="Calibri"/>
-          <w:sz w:val="22"/>
-          <w:szCs w:val="22"/>
-          <w:color w:val="000000"/>
-        </w:rPr>
-        <w:t xml:space="preserve"> · </w:t>
-      </w:r>
-      <w:hyperlink r:id="rIdCV20">
-        <w:r>
-          <w:rPr>
-            <w:rFonts w:cs="Calibri"/>
-            <w:sz w:val="22"/>
-            <w:szCs w:val="22"/>
-            <w:color w:val="0000FF"/>
-          </w:rPr>
-          <w:t xml:space="preserve">R Shiny tools</w:t>
-        </w:r>
-      </w:hyperlink>
+        <w:t xml:space="preserve">UniCAV · Single-cell RNA-seq workflows · RNA-seq molecular subtyping · R Shiny tools</w:t>
+      </w:r>
     </w:p>
     <w:sectPr>
       <w:pgSz w:w="11906" w:h="16838"/>

</xml_diff>

<commit_message>
Clarify CV experience hierarchy and simplify publication heading
</commit_message>
<xml_diff>
--- a/uploads/Shu_Hu_CV_EN.docx
+++ b/uploads/Shu_Hu_CV_EN.docx
@@ -93,7 +93,7 @@
           <w:szCs w:val="22"/>
           <w:color w:val="000000"/>
         </w:rPr>
-        <w:t xml:space="preserve">shu25@m.fudan.edu.cn  |  hushuzuiniu.github.io</w:t>
+        <w:t xml:space="preserve">shu25@m.fudan.edu.cn  |  https://hushuzuiniu.github.io/</w:t>
       </w:r>
     </w:p>
     <w:p>
@@ -385,7 +385,7 @@
           <w:b/>
           <w:highlight w:val="lightGray"/>
         </w:rPr>
-        <w:t xml:space="preserve">PUBLICATIONS AND MANUSCRIPTS</w:t>
+        <w:t xml:space="preserve">PUBLICATIONS</w:t>
       </w:r>
     </w:p>
     <w:p>
@@ -1151,7 +1151,7 @@
           <w:color w:val="000000" w:themeColor="text1"/>
           <w:szCs w:val="21"/>
         </w:rPr>
-        <w:spacing w:before="0" w:after="0" w:line="320" w:lineRule="exact"/>
+        <w:spacing w:before="0" w:after="20" w:line="320" w:lineRule="exact"/>
         <w:keepLines/>
         <w:snapToGrid w:val="0"/>
         <w:keepNext/>
@@ -1162,20 +1162,20 @@
       <w:r>
         <w:rPr>
           <w:rFonts w:cs="Calibri"/>
-          <w:sz w:val="22"/>
-          <w:szCs w:val="22"/>
-          <w:color w:val="000000"/>
-          <w:b/>
+          <w:sz w:val="24"/>
+          <w:szCs w:val="24"/>
+          <w:color w:val="000000"/>
+          <w:b/>
+          <w:bCs/>
         </w:rPr>
         <w:t xml:space="preserve">Fudan University</w:t>
       </w:r>
       <w:r>
         <w:rPr>
           <w:rFonts w:cs="Calibri"/>
-          <w:sz w:val="22"/>
-          <w:szCs w:val="22"/>
-          <w:color w:val="000000"/>
-          <w:b/>
+          <w:sz w:val="21"/>
+          <w:szCs w:val="21"/>
+          <w:color w:val="595959"/>
         </w:rPr>
         <w:tab/>
         <w:t xml:space="preserve">Sep 2025 – present</w:t>
@@ -1189,7 +1189,7 @@
           <w:color w:val="000000" w:themeColor="text1"/>
           <w:szCs w:val="21"/>
         </w:rPr>
-        <w:spacing w:before="0" w:after="60" w:line="320" w:lineRule="exact"/>
+        <w:spacing w:before="0" w:after="80" w:line="280" w:lineRule="exact"/>
         <w:keepLines/>
         <w:snapToGrid w:val="0"/>
         <w:keepNext/>
@@ -1200,6 +1200,15 @@
           <w:sz w:val="22"/>
           <w:szCs w:val="22"/>
           <w:color w:val="000000"/>
+        </w:rPr>
+      </w:r>
+      <w:r>
+        <w:rPr>
+          <w:rFonts w:cs="Calibri"/>
+          <w:sz w:val="21"/>
+          <w:szCs w:val="21"/>
+          <w:color w:val="595959"/>
+          <w:i/>
         </w:rPr>
         <w:t xml:space="preserve">PhD Research</w:t>
       </w:r>
@@ -1278,7 +1287,7 @@
           <w:color w:val="000000" w:themeColor="text1"/>
           <w:szCs w:val="21"/>
         </w:rPr>
-        <w:spacing w:before="0" w:after="0" w:line="320" w:lineRule="exact"/>
+        <w:spacing w:before="120" w:after="20" w:line="320" w:lineRule="exact"/>
         <w:keepLines/>
         <w:snapToGrid w:val="0"/>
         <w:keepNext/>
@@ -1289,20 +1298,20 @@
       <w:r>
         <w:rPr>
           <w:rFonts w:cs="Calibri"/>
-          <w:sz w:val="22"/>
-          <w:szCs w:val="22"/>
-          <w:color w:val="000000"/>
-          <w:b/>
+          <w:sz w:val="24"/>
+          <w:szCs w:val="24"/>
+          <w:color w:val="000000"/>
+          <w:b/>
+          <w:bCs/>
         </w:rPr>
         <w:t xml:space="preserve">The University of Hong Kong</w:t>
       </w:r>
       <w:r>
         <w:rPr>
           <w:rFonts w:cs="Calibri"/>
-          <w:sz w:val="22"/>
-          <w:szCs w:val="22"/>
-          <w:color w:val="000000"/>
-          <w:b/>
+          <w:sz w:val="21"/>
+          <w:szCs w:val="21"/>
+          <w:color w:val="595959"/>
         </w:rPr>
         <w:tab/>
         <w:t xml:space="preserve">Jun 2023 – Jun 2024</w:t>
@@ -1316,7 +1325,7 @@
           <w:color w:val="000000" w:themeColor="text1"/>
           <w:szCs w:val="21"/>
         </w:rPr>
-        <w:spacing w:before="0" w:after="60" w:line="320" w:lineRule="exact"/>
+        <w:spacing w:before="0" w:after="80" w:line="280" w:lineRule="exact"/>
         <w:keepLines/>
         <w:snapToGrid w:val="0"/>
         <w:keepNext/>
@@ -1327,6 +1336,15 @@
           <w:sz w:val="22"/>
           <w:szCs w:val="22"/>
           <w:color w:val="000000"/>
+        </w:rPr>
+      </w:r>
+      <w:r>
+        <w:rPr>
+          <w:rFonts w:cs="Calibri"/>
+          <w:sz w:val="21"/>
+          <w:szCs w:val="21"/>
+          <w:color w:val="595959"/>
+          <w:i/>
         </w:rPr>
         <w:t xml:space="preserve">Research Assistant I</w:t>
       </w:r>
@@ -1438,7 +1456,7 @@
           <w:color w:val="000000" w:themeColor="text1"/>
           <w:szCs w:val="21"/>
         </w:rPr>
-        <w:spacing w:before="80" w:after="0" w:line="320" w:lineRule="exact"/>
+        <w:spacing w:before="120" w:after="20" w:line="320" w:lineRule="exact"/>
         <w:keepLines/>
         <w:snapToGrid w:val="0"/>
         <w:keepNext/>
@@ -1449,20 +1467,20 @@
       <w:r>
         <w:rPr>
           <w:rFonts w:cs="Calibri"/>
-          <w:sz w:val="22"/>
-          <w:szCs w:val="22"/>
-          <w:color w:val="000000"/>
-          <w:b/>
+          <w:sz w:val="24"/>
+          <w:szCs w:val="24"/>
+          <w:color w:val="000000"/>
+          <w:b/>
+          <w:bCs/>
         </w:rPr>
         <w:t xml:space="preserve">Shanghai Rightongene Technology Co., Ltd.</w:t>
       </w:r>
       <w:r>
         <w:rPr>
           <w:rFonts w:cs="Calibri"/>
-          <w:sz w:val="22"/>
-          <w:szCs w:val="22"/>
-          <w:color w:val="000000"/>
-          <w:b/>
+          <w:sz w:val="21"/>
+          <w:szCs w:val="21"/>
+          <w:color w:val="595959"/>
         </w:rPr>
         <w:tab/>
         <w:t xml:space="preserve">2024 – May 2025; Sep 2022 – May 2023</w:t>
@@ -1476,7 +1494,7 @@
           <w:color w:val="000000" w:themeColor="text1"/>
           <w:szCs w:val="21"/>
         </w:rPr>
-        <w:spacing w:before="0" w:after="60" w:line="320" w:lineRule="exact"/>
+        <w:spacing w:before="0" w:after="80" w:line="280" w:lineRule="exact"/>
         <w:keepLines/>
         <w:snapToGrid w:val="0"/>
         <w:keepNext/>
@@ -1487,6 +1505,15 @@
           <w:sz w:val="22"/>
           <w:szCs w:val="22"/>
           <w:color w:val="000000"/>
+        </w:rPr>
+      </w:r>
+      <w:r>
+        <w:rPr>
+          <w:rFonts w:cs="Calibri"/>
+          <w:sz w:val="21"/>
+          <w:szCs w:val="21"/>
+          <w:color w:val="595959"/>
+          <w:i/>
         </w:rPr>
         <w:t xml:space="preserve">Bioinformatics Engineer</w:t>
       </w:r>
@@ -1631,7 +1658,7 @@
           <w:color w:val="000000" w:themeColor="text1"/>
           <w:szCs w:val="21"/>
         </w:rPr>
-        <w:spacing w:before="100" w:after="0" w:line="320" w:lineRule="exact"/>
+        <w:spacing w:before="120" w:after="20" w:line="320" w:lineRule="exact"/>
         <w:keepLines/>
         <w:snapToGrid w:val="0"/>
         <w:keepNext/>
@@ -1642,20 +1669,20 @@
       <w:r>
         <w:rPr>
           <w:rFonts w:cs="Calibri"/>
-          <w:sz w:val="22"/>
-          <w:szCs w:val="22"/>
-          <w:color w:val="000000"/>
-          <w:b/>
+          <w:sz w:val="24"/>
+          <w:szCs w:val="24"/>
+          <w:color w:val="000000"/>
+          <w:b/>
+          <w:bCs/>
         </w:rPr>
         <w:t xml:space="preserve">The University of Edinburgh</w:t>
       </w:r>
       <w:r>
         <w:rPr>
           <w:rFonts w:cs="Calibri"/>
-          <w:sz w:val="22"/>
-          <w:szCs w:val="22"/>
-          <w:color w:val="000000"/>
-          <w:b/>
+          <w:sz w:val="21"/>
+          <w:szCs w:val="21"/>
+          <w:color w:val="595959"/>
         </w:rPr>
         <w:tab/>
         <w:t xml:space="preserve">Feb – Sep 2022</w:t>
@@ -1669,7 +1696,7 @@
           <w:color w:val="000000" w:themeColor="text1"/>
           <w:szCs w:val="21"/>
         </w:rPr>
-        <w:spacing w:before="0" w:after="60" w:line="320" w:lineRule="exact"/>
+        <w:spacing w:before="0" w:after="80" w:line="280" w:lineRule="exact"/>
         <w:keepLines/>
         <w:snapToGrid w:val="0"/>
         <w:keepNext/>
@@ -1680,6 +1707,15 @@
           <w:sz w:val="22"/>
           <w:szCs w:val="22"/>
           <w:color w:val="000000"/>
+        </w:rPr>
+      </w:r>
+      <w:r>
+        <w:rPr>
+          <w:rFonts w:cs="Calibri"/>
+          <w:sz w:val="21"/>
+          <w:szCs w:val="21"/>
+          <w:color w:val="595959"/>
+          <w:i/>
         </w:rPr>
         <w:t xml:space="preserve">MSc Research</w:t>
       </w:r>
@@ -1725,7 +1761,7 @@
           <w:color w:val="000000" w:themeColor="text1"/>
           <w:szCs w:val="21"/>
         </w:rPr>
-        <w:spacing w:before="60" w:after="0" w:line="320" w:lineRule="exact"/>
+        <w:spacing w:before="120" w:after="20" w:line="320" w:lineRule="exact"/>
         <w:keepLines/>
         <w:snapToGrid w:val="0"/>
         <w:keepNext/>
@@ -1736,20 +1772,20 @@
       <w:r>
         <w:rPr>
           <w:rFonts w:cs="Calibri"/>
-          <w:sz w:val="22"/>
-          <w:szCs w:val="22"/>
-          <w:color w:val="000000"/>
-          <w:b/>
+          <w:sz w:val="24"/>
+          <w:szCs w:val="24"/>
+          <w:color w:val="000000"/>
+          <w:b/>
+          <w:bCs/>
         </w:rPr>
         <w:t xml:space="preserve">Sichuan WoWente Biotechnology Co., Ltd.</w:t>
       </w:r>
       <w:r>
         <w:rPr>
           <w:rFonts w:cs="Calibri"/>
-          <w:sz w:val="22"/>
-          <w:szCs w:val="22"/>
-          <w:color w:val="000000"/>
-          <w:b/>
+          <w:sz w:val="21"/>
+          <w:szCs w:val="21"/>
+          <w:color w:val="595959"/>
         </w:rPr>
         <w:tab/>
         <w:t xml:space="preserve">May 2020 – May 2021</w:t>
@@ -1763,7 +1799,7 @@
           <w:color w:val="000000" w:themeColor="text1"/>
           <w:szCs w:val="21"/>
         </w:rPr>
-        <w:spacing w:before="0" w:after="60" w:line="320" w:lineRule="exact"/>
+        <w:spacing w:before="0" w:after="80" w:line="280" w:lineRule="exact"/>
         <w:keepLines/>
         <w:snapToGrid w:val="0"/>
         <w:keepNext/>
@@ -1774,6 +1810,15 @@
           <w:sz w:val="22"/>
           <w:szCs w:val="22"/>
           <w:color w:val="000000"/>
+        </w:rPr>
+      </w:r>
+      <w:r>
+        <w:rPr>
+          <w:rFonts w:cs="Calibri"/>
+          <w:sz w:val="21"/>
+          <w:szCs w:val="21"/>
+          <w:color w:val="595959"/>
+          <w:i/>
         </w:rPr>
         <w:t xml:space="preserve">Reagent Developer</w:t>
       </w:r>

</xml_diff>

<commit_message>
Refine academic CV typography and emphasize dates
</commit_message>
<xml_diff>
--- a/uploads/Shu_Hu_CV_EN.docx
+++ b/uploads/Shu_Hu_CV_EN.docx
@@ -10,7 +10,7 @@
           <w:color w:val="000000" w:themeColor="text1"/>
           <w:szCs w:val="21"/>
         </w:rPr>
-        <w:spacing w:before="0" w:after="80" w:line="520" w:lineRule="exact"/>
+        <w:spacing w:before="0" w:after="60" w:line="320" w:lineRule="exact"/>
         <w:keepLines/>
         <w:snapToGrid w:val="0"/>
         <w:jc w:val="center"/>
@@ -18,98 +18,98 @@
       <w:r>
         <w:rPr>
           <w:rFonts w:cs="Calibri"/>
-          <w:sz w:val="44"/>
-          <w:szCs w:val="22"/>
-          <w:color w:val="000000"/>
-          <w:b/>
-        </w:rPr>
-        <w:t xml:space="preserve">Curriculum Vitae</w:t>
-      </w:r>
-    </w:p>
-    <w:p>
-      <w:pPr>
-        <w:rPr>
-          <w:rFonts w:cs="Calibri"/>
-          <w:bCs/>
-          <w:color w:val="000000" w:themeColor="text1"/>
-          <w:szCs w:val="21"/>
-        </w:rPr>
-        <w:spacing w:before="0" w:after="60" w:line="320" w:lineRule="exact"/>
-        <w:keepLines/>
-        <w:snapToGrid w:val="0"/>
-        <w:jc w:val="center"/>
-      </w:pPr>
-      <w:r>
-        <w:rPr>
-          <w:rFonts w:cs="Calibri"/>
-          <w:sz w:val="28"/>
-          <w:szCs w:val="22"/>
-          <w:color w:val="000000"/>
-          <w:b/>
-        </w:rPr>
-        <w:t xml:space="preserve">Shu Hu</w:t>
-      </w:r>
-    </w:p>
-    <w:p>
-      <w:pPr>
-        <w:rPr>
-          <w:rFonts w:cs="Calibri"/>
-          <w:bCs/>
-          <w:color w:val="000000" w:themeColor="text1"/>
-          <w:szCs w:val="21"/>
-        </w:rPr>
-        <w:spacing w:before="0" w:after="40" w:line="320" w:lineRule="exact"/>
-        <w:keepLines/>
-        <w:snapToGrid w:val="0"/>
-        <w:jc w:val="center"/>
-      </w:pPr>
-      <w:r>
-        <w:rPr>
-          <w:rFonts w:cs="Calibri"/>
-          <w:sz w:val="22"/>
-          <w:szCs w:val="22"/>
-          <w:color w:val="000000"/>
-        </w:rPr>
-        <w:t xml:space="preserve">PhD Student · Department of Microbiology · Fudan University</w:t>
-      </w:r>
-    </w:p>
-    <w:p>
-      <w:pPr>
-        <w:rPr>
-          <w:rFonts w:cs="Calibri"/>
-          <w:bCs/>
-          <w:color w:val="000000" w:themeColor="text1"/>
-          <w:szCs w:val="21"/>
-        </w:rPr>
-        <w:spacing w:before="0" w:after="80" w:line="320" w:lineRule="exact"/>
-        <w:keepLines/>
-        <w:snapToGrid w:val="0"/>
-        <w:jc w:val="center"/>
-      </w:pPr>
-      <w:r>
-        <w:rPr>
-          <w:rFonts w:cs="Calibri"/>
-          <w:sz w:val="22"/>
-          <w:szCs w:val="22"/>
-          <w:color w:val="000000"/>
-        </w:rPr>
-        <w:t xml:space="preserve">shu25@m.fudan.edu.cn  |  https://hushuzuiniu.github.io/</w:t>
-      </w:r>
-    </w:p>
-    <w:p>
-      <w:pPr>
-        <w:rPr>
-          <w:rFonts w:cs="Calibri"/>
-          <w:b/>
-          <w:color w:val="000000" w:themeColor="text1"/>
           <w:sz w:val="24"/>
           <w:szCs w:val="24"/>
-        </w:rPr>
-        <w:spacing w:before="160" w:after="120" w:line="320" w:lineRule="exact"/>
+          <w:color w:val="595959"/>
+        </w:rPr>
+        <w:t xml:space="preserve">Curriculum Vitae</w:t>
+      </w:r>
+    </w:p>
+    <w:p>
+      <w:pPr>
+        <w:rPr>
+          <w:rFonts w:cs="Calibri"/>
+          <w:bCs/>
+          <w:color w:val="000000" w:themeColor="text1"/>
+          <w:szCs w:val="21"/>
+        </w:rPr>
+        <w:spacing w:before="0" w:after="60" w:line="520" w:lineRule="exact"/>
+        <w:keepLines/>
+        <w:snapToGrid w:val="0"/>
+        <w:jc w:val="center"/>
+      </w:pPr>
+      <w:r>
+        <w:rPr>
+          <w:rFonts w:cs="Calibri"/>
+          <w:sz w:val="44"/>
+          <w:szCs w:val="44"/>
+          <w:color w:val="000000"/>
+          <w:b/>
+          <w:bCs/>
+        </w:rPr>
+        <w:t xml:space="preserve">Shu Hu</w:t>
+      </w:r>
+    </w:p>
+    <w:p>
+      <w:pPr>
+        <w:rPr>
+          <w:rFonts w:cs="Calibri"/>
+          <w:bCs/>
+          <w:color w:val="000000" w:themeColor="text1"/>
+          <w:szCs w:val="21"/>
+        </w:rPr>
+        <w:spacing w:before="0" w:after="40" w:line="320" w:lineRule="exact"/>
+        <w:keepLines/>
+        <w:snapToGrid w:val="0"/>
+        <w:jc w:val="center"/>
+      </w:pPr>
+      <w:r>
+        <w:rPr>
+          <w:rFonts w:cs="Calibri"/>
+          <w:sz w:val="22"/>
+          <w:szCs w:val="22"/>
+          <w:color w:val="000000"/>
+        </w:rPr>
+        <w:t xml:space="preserve">PhD Student · Department of Microbiology · Fudan University</w:t>
+      </w:r>
+    </w:p>
+    <w:p>
+      <w:pPr>
+        <w:rPr>
+          <w:rFonts w:cs="Calibri"/>
+          <w:bCs/>
+          <w:color w:val="000000" w:themeColor="text1"/>
+          <w:szCs w:val="21"/>
+        </w:rPr>
+        <w:spacing w:before="0" w:after="80" w:line="320" w:lineRule="exact"/>
+        <w:keepLines/>
+        <w:snapToGrid w:val="0"/>
+        <w:jc w:val="center"/>
+      </w:pPr>
+      <w:r>
+        <w:rPr>
+          <w:rFonts w:cs="Calibri"/>
+          <w:sz w:val="22"/>
+          <w:szCs w:val="22"/>
+          <w:color w:val="000000"/>
+        </w:rPr>
+        <w:t xml:space="preserve">shu25@m.fudan.edu.cn  |  https://hushuzuiniu.github.io/</w:t>
+      </w:r>
+    </w:p>
+    <w:p>
+      <w:pPr>
+        <w:rPr>
+          <w:rFonts w:cs="Calibri"/>
+          <w:b/>
+          <w:color w:val="000000" w:themeColor="text1"/>
+          <w:sz w:val="24"/>
+          <w:szCs w:val="24"/>
+        </w:rPr>
+        <w:spacing w:before="180" w:after="140" w:line="320" w:lineRule="exact"/>
         <w:keepLines/>
         <w:snapToGrid w:val="0"/>
         <w:pBdr>
-          <w:bottom w:val="single" w:sz="12" w:space="3" w:color="000000"/>
+          <w:bottom w:val="single" w:sz="6" w:space="4" w:color="000000"/>
         </w:pBdr>
         <w:keepNext/>
       </w:pPr>
@@ -120,7 +120,7 @@
           <w:szCs w:val="24"/>
           <w:color w:val="000000"/>
           <w:b/>
-          <w:highlight w:val="lightGray"/>
+          <w:bCs/>
         </w:rPr>
         <w:t xml:space="preserve">EDUCATIONAL BACKGROUND</w:t>
       </w:r>
@@ -133,7 +133,7 @@
           <w:color w:val="000000" w:themeColor="text1"/>
           <w:szCs w:val="21"/>
         </w:rPr>
-        <w:spacing w:before="0" w:after="40" w:line="320" w:lineRule="exact"/>
+        <w:spacing w:before="0" w:after="20" w:line="320" w:lineRule="exact"/>
         <w:keepLines/>
         <w:snapToGrid w:val="0"/>
         <w:keepNext/>
@@ -144,10 +144,11 @@
       <w:r>
         <w:rPr>
           <w:rFonts w:cs="Calibri"/>
-          <w:sz w:val="22"/>
-          <w:szCs w:val="22"/>
-          <w:color w:val="000000"/>
-          <w:b/>
+          <w:sz w:val="23"/>
+          <w:szCs w:val="23"/>
+          <w:color w:val="000000"/>
+          <w:b/>
+          <w:bCs/>
         </w:rPr>
         <w:t xml:space="preserve">Fudan University</w:t>
       </w:r>
@@ -158,6 +159,7 @@
           <w:szCs w:val="22"/>
           <w:color w:val="000000"/>
           <w:b/>
+          <w:bCs/>
         </w:rPr>
         <w:tab/>
         <w:t xml:space="preserve">Sep 2025 – Jun 2029 (expected)</w:t>
@@ -193,7 +195,7 @@
           <w:color w:val="000000" w:themeColor="text1"/>
           <w:szCs w:val="21"/>
         </w:rPr>
-        <w:spacing w:before="0" w:after="40" w:line="320" w:lineRule="exact"/>
+        <w:spacing w:before="60" w:after="20" w:line="320" w:lineRule="exact"/>
         <w:keepLines/>
         <w:snapToGrid w:val="0"/>
         <w:keepNext/>
@@ -204,10 +206,11 @@
       <w:r>
         <w:rPr>
           <w:rFonts w:cs="Calibri"/>
-          <w:sz w:val="22"/>
-          <w:szCs w:val="22"/>
-          <w:color w:val="000000"/>
-          <w:b/>
+          <w:sz w:val="23"/>
+          <w:szCs w:val="23"/>
+          <w:color w:val="000000"/>
+          <w:b/>
+          <w:bCs/>
         </w:rPr>
         <w:t xml:space="preserve">The University of Edinburgh</w:t>
       </w:r>
@@ -218,6 +221,7 @@
           <w:szCs w:val="22"/>
           <w:color w:val="000000"/>
           <w:b/>
+          <w:bCs/>
         </w:rPr>
         <w:tab/>
         <w:t xml:space="preserve">Sep 2021 – Nov 2022</w:t>
@@ -253,7 +257,7 @@
           <w:color w:val="000000" w:themeColor="text1"/>
           <w:szCs w:val="21"/>
         </w:rPr>
-        <w:spacing w:before="0" w:after="40" w:line="320" w:lineRule="exact"/>
+        <w:spacing w:before="60" w:after="20" w:line="320" w:lineRule="exact"/>
         <w:keepLines/>
         <w:snapToGrid w:val="0"/>
         <w:keepNext/>
@@ -264,10 +268,11 @@
       <w:r>
         <w:rPr>
           <w:rFonts w:cs="Calibri"/>
-          <w:sz w:val="22"/>
-          <w:szCs w:val="22"/>
-          <w:color w:val="000000"/>
-          <w:b/>
+          <w:sz w:val="23"/>
+          <w:szCs w:val="23"/>
+          <w:color w:val="000000"/>
+          <w:b/>
+          <w:bCs/>
         </w:rPr>
         <w:t xml:space="preserve">Sichuan Agricultural University</w:t>
       </w:r>
@@ -278,6 +283,7 @@
           <w:szCs w:val="22"/>
           <w:color w:val="000000"/>
           <w:b/>
+          <w:bCs/>
         </w:rPr>
         <w:tab/>
         <w:t xml:space="preserve">Sep 2016 – Jun 2020</w:t>
@@ -346,6 +352,7 @@
           <w:szCs w:val="22"/>
           <w:color w:val="000000"/>
           <w:b/>
+          <w:bCs/>
         </w:rPr>
         <w:t xml:space="preserve">RESEARCH FOCUS: </w:t>
       </w:r>
@@ -368,11 +375,11 @@
           <w:sz w:val="24"/>
           <w:szCs w:val="24"/>
         </w:rPr>
-        <w:spacing w:before="160" w:after="120" w:line="320" w:lineRule="exact"/>
+        <w:spacing w:before="180" w:after="140" w:line="320" w:lineRule="exact"/>
         <w:keepLines/>
         <w:snapToGrid w:val="0"/>
         <w:pBdr>
-          <w:bottom w:val="single" w:sz="12" w:space="3" w:color="000000"/>
+          <w:bottom w:val="single" w:sz="6" w:space="4" w:color="000000"/>
         </w:pBdr>
         <w:keepNext/>
       </w:pPr>
@@ -383,7 +390,7 @@
           <w:szCs w:val="24"/>
           <w:color w:val="000000"/>
           <w:b/>
-          <w:highlight w:val="lightGray"/>
+          <w:bCs/>
         </w:rPr>
         <w:t xml:space="preserve">PUBLICATIONS</w:t>
       </w:r>
@@ -426,6 +433,7 @@
           <w:szCs w:val="22"/>
           <w:color w:val="000000"/>
           <w:b/>
+          <w:bCs/>
         </w:rPr>
         <w:t xml:space="preserve">Hu S</w:t>
       </w:r>
@@ -473,6 +481,7 @@
           <w:szCs w:val="22"/>
           <w:color w:val="000000"/>
           <w:b/>
+          <w:bCs/>
         </w:rPr>
         <w:t xml:space="preserve">Under revision</w:t>
       </w:r>
@@ -516,6 +525,7 @@
           <w:szCs w:val="22"/>
           <w:color w:val="000000"/>
           <w:b/>
+          <w:bCs/>
         </w:rPr>
         <w:t xml:space="preserve">Hu S</w:t>
       </w:r>
@@ -562,7 +572,7 @@
             <w:rFonts w:cs="Calibri"/>
             <w:sz w:val="22"/>
             <w:szCs w:val="22"/>
-            <w:color w:val="0000FF"/>
+            <w:color w:val="174A73"/>
           </w:rPr>
           <w:t xml:space="preserve">doi: 10.1145/3770855.3819057</w:t>
         </w:r>
@@ -607,6 +617,7 @@
           <w:szCs w:val="22"/>
           <w:color w:val="000000"/>
           <w:b/>
+          <w:bCs/>
         </w:rPr>
         <w:t xml:space="preserve">Hu S</w:t>
       </w:r>
@@ -653,7 +664,7 @@
             <w:rFonts w:cs="Calibri"/>
             <w:sz w:val="22"/>
             <w:szCs w:val="22"/>
-            <w:color w:val="0000FF"/>
+            <w:color w:val="174A73"/>
           </w:rPr>
           <w:t xml:space="preserve">doi: 10.64898/2026.07.22.739994</w:t>
         </w:r>
@@ -698,6 +709,7 @@
           <w:szCs w:val="22"/>
           <w:color w:val="000000"/>
           <w:b/>
+          <w:bCs/>
         </w:rPr>
         <w:t xml:space="preserve">Hu S</w:t>
       </w:r>
@@ -744,7 +756,7 @@
             <w:rFonts w:cs="Calibri"/>
             <w:sz w:val="22"/>
             <w:szCs w:val="22"/>
-            <w:color w:val="0000FF"/>
+            <w:color w:val="174A73"/>
           </w:rPr>
           <w:t xml:space="preserve">doi: 10.64898/2026.05.07.26352673</w:t>
         </w:r>
@@ -789,6 +801,7 @@
           <w:szCs w:val="22"/>
           <w:color w:val="000000"/>
           <w:b/>
+          <w:bCs/>
         </w:rPr>
         <w:t xml:space="preserve">Hu S</w:t>
       </w:r>
@@ -835,7 +848,7 @@
             <w:rFonts w:cs="Calibri"/>
             <w:sz w:val="22"/>
             <w:szCs w:val="22"/>
-            <w:color w:val="0000FF"/>
+            <w:color w:val="174A73"/>
           </w:rPr>
           <w:t xml:space="preserve">doi: 10.1056/NEJMc2504302</w:t>
         </w:r>
@@ -879,6 +892,7 @@
           <w:szCs w:val="22"/>
           <w:color w:val="000000"/>
           <w:b/>
+          <w:bCs/>
         </w:rPr>
         <w:t xml:space="preserve">Hu S</w:t>
       </w:r>
@@ -925,7 +939,7 @@
             <w:rFonts w:cs="Calibri"/>
             <w:sz w:val="22"/>
             <w:szCs w:val="22"/>
-            <w:color w:val="0000FF"/>
+            <w:color w:val="174A73"/>
           </w:rPr>
           <w:t xml:space="preserve">doi: 10.1080/22221751.2025.2547736</w:t>
         </w:r>
@@ -970,6 +984,7 @@
           <w:szCs w:val="22"/>
           <w:color w:val="000000"/>
           <w:b/>
+          <w:bCs/>
         </w:rPr>
         <w:t xml:space="preserve">Hu S</w:t>
       </w:r>
@@ -1016,7 +1031,7 @@
             <w:rFonts w:cs="Calibri"/>
             <w:sz w:val="22"/>
             <w:szCs w:val="22"/>
-            <w:color w:val="0000FF"/>
+            <w:color w:val="174A73"/>
           </w:rPr>
           <w:t xml:space="preserve">doi: 10.1128/jvi.01145-24</w:t>
         </w:r>
@@ -1061,6 +1076,7 @@
           <w:szCs w:val="22"/>
           <w:color w:val="000000"/>
           <w:b/>
+          <w:bCs/>
         </w:rPr>
         <w:t xml:space="preserve">Hu S</w:t>
       </w:r>
@@ -1107,7 +1123,7 @@
             <w:rFonts w:cs="Calibri"/>
             <w:sz w:val="22"/>
             <w:szCs w:val="22"/>
-            <w:color w:val="0000FF"/>
+            <w:color w:val="174A73"/>
           </w:rPr>
           <w:t xml:space="preserve">doi: 10.1093/molbev/msae232</w:t>
         </w:r>
@@ -1122,12 +1138,12 @@
           <w:sz w:val="24"/>
           <w:szCs w:val="24"/>
         </w:rPr>
-        <w:spacing w:before="160" w:after="120" w:line="320" w:lineRule="exact"/>
+        <w:spacing w:before="180" w:after="140" w:line="320" w:lineRule="exact"/>
         <w:keepLines/>
         <w:snapToGrid w:val="0"/>
         <w:pageBreakBefore/>
         <w:pBdr>
-          <w:bottom w:val="single" w:sz="12" w:space="3" w:color="000000"/>
+          <w:bottom w:val="single" w:sz="6" w:space="4" w:color="000000"/>
         </w:pBdr>
         <w:keepNext/>
       </w:pPr>
@@ -1138,7 +1154,7 @@
           <w:szCs w:val="24"/>
           <w:color w:val="000000"/>
           <w:b/>
-          <w:highlight w:val="lightGray"/>
+          <w:bCs/>
         </w:rPr>
         <w:t xml:space="preserve">RESEARCH AND PROFESSIONAL EXPERIENCE</w:t>
       </w:r>
@@ -1162,8 +1178,8 @@
       <w:r>
         <w:rPr>
           <w:rFonts w:cs="Calibri"/>
-          <w:sz w:val="24"/>
-          <w:szCs w:val="24"/>
+          <w:sz w:val="23"/>
+          <w:szCs w:val="23"/>
           <w:color w:val="000000"/>
           <w:b/>
           <w:bCs/>
@@ -1173,9 +1189,11 @@
       <w:r>
         <w:rPr>
           <w:rFonts w:cs="Calibri"/>
-          <w:sz w:val="21"/>
-          <w:szCs w:val="21"/>
-          <w:color w:val="595959"/>
+          <w:sz w:val="22"/>
+          <w:szCs w:val="22"/>
+          <w:color w:val="000000"/>
+          <w:b/>
+          <w:bCs/>
         </w:rPr>
         <w:tab/>
         <w:t xml:space="preserve">Sep 2025 – present</w:t>
@@ -1287,7 +1305,7 @@
           <w:color w:val="000000" w:themeColor="text1"/>
           <w:szCs w:val="21"/>
         </w:rPr>
-        <w:spacing w:before="120" w:after="20" w:line="320" w:lineRule="exact"/>
+        <w:spacing w:before="160" w:after="20" w:line="320" w:lineRule="exact"/>
         <w:keepLines/>
         <w:snapToGrid w:val="0"/>
         <w:keepNext/>
@@ -1298,8 +1316,8 @@
       <w:r>
         <w:rPr>
           <w:rFonts w:cs="Calibri"/>
-          <w:sz w:val="24"/>
-          <w:szCs w:val="24"/>
+          <w:sz w:val="23"/>
+          <w:szCs w:val="23"/>
           <w:color w:val="000000"/>
           <w:b/>
           <w:bCs/>
@@ -1309,9 +1327,11 @@
       <w:r>
         <w:rPr>
           <w:rFonts w:cs="Calibri"/>
-          <w:sz w:val="21"/>
-          <w:szCs w:val="21"/>
-          <w:color w:val="595959"/>
+          <w:sz w:val="22"/>
+          <w:szCs w:val="22"/>
+          <w:color w:val="000000"/>
+          <w:b/>
+          <w:bCs/>
         </w:rPr>
         <w:tab/>
         <w:t xml:space="preserve">Jun 2023 – Jun 2024</w:t>
@@ -1456,7 +1476,7 @@
           <w:color w:val="000000" w:themeColor="text1"/>
           <w:szCs w:val="21"/>
         </w:rPr>
-        <w:spacing w:before="120" w:after="20" w:line="320" w:lineRule="exact"/>
+        <w:spacing w:before="160" w:after="20" w:line="320" w:lineRule="exact"/>
         <w:keepLines/>
         <w:snapToGrid w:val="0"/>
         <w:keepNext/>
@@ -1467,8 +1487,8 @@
       <w:r>
         <w:rPr>
           <w:rFonts w:cs="Calibri"/>
-          <w:sz w:val="24"/>
-          <w:szCs w:val="24"/>
+          <w:sz w:val="23"/>
+          <w:szCs w:val="23"/>
           <w:color w:val="000000"/>
           <w:b/>
           <w:bCs/>
@@ -1478,9 +1498,11 @@
       <w:r>
         <w:rPr>
           <w:rFonts w:cs="Calibri"/>
-          <w:sz w:val="21"/>
-          <w:szCs w:val="21"/>
-          <w:color w:val="595959"/>
+          <w:sz w:val="22"/>
+          <w:szCs w:val="22"/>
+          <w:color w:val="000000"/>
+          <w:b/>
+          <w:bCs/>
         </w:rPr>
         <w:tab/>
         <w:t xml:space="preserve">2024 – May 2025; Sep 2022 – May 2023</w:t>
@@ -1658,7 +1680,7 @@
           <w:color w:val="000000" w:themeColor="text1"/>
           <w:szCs w:val="21"/>
         </w:rPr>
-        <w:spacing w:before="120" w:after="20" w:line="320" w:lineRule="exact"/>
+        <w:spacing w:before="160" w:after="20" w:line="320" w:lineRule="exact"/>
         <w:keepLines/>
         <w:snapToGrid w:val="0"/>
         <w:keepNext/>
@@ -1669,8 +1691,8 @@
       <w:r>
         <w:rPr>
           <w:rFonts w:cs="Calibri"/>
-          <w:sz w:val="24"/>
-          <w:szCs w:val="24"/>
+          <w:sz w:val="23"/>
+          <w:szCs w:val="23"/>
           <w:color w:val="000000"/>
           <w:b/>
           <w:bCs/>
@@ -1680,9 +1702,11 @@
       <w:r>
         <w:rPr>
           <w:rFonts w:cs="Calibri"/>
-          <w:sz w:val="21"/>
-          <w:szCs w:val="21"/>
-          <w:color w:val="595959"/>
+          <w:sz w:val="22"/>
+          <w:szCs w:val="22"/>
+          <w:color w:val="000000"/>
+          <w:b/>
+          <w:bCs/>
         </w:rPr>
         <w:tab/>
         <w:t xml:space="preserve">Feb – Sep 2022</w:t>
@@ -1761,7 +1785,7 @@
           <w:color w:val="000000" w:themeColor="text1"/>
           <w:szCs w:val="21"/>
         </w:rPr>
-        <w:spacing w:before="120" w:after="20" w:line="320" w:lineRule="exact"/>
+        <w:spacing w:before="160" w:after="20" w:line="320" w:lineRule="exact"/>
         <w:keepLines/>
         <w:snapToGrid w:val="0"/>
         <w:keepNext/>
@@ -1772,104 +1796,106 @@
       <w:r>
         <w:rPr>
           <w:rFonts w:cs="Calibri"/>
+          <w:sz w:val="23"/>
+          <w:szCs w:val="23"/>
+          <w:color w:val="000000"/>
+          <w:b/>
+          <w:bCs/>
+        </w:rPr>
+        <w:t xml:space="preserve">Sichuan WoWente Biotechnology Co., Ltd.</w:t>
+      </w:r>
+      <w:r>
+        <w:rPr>
+          <w:rFonts w:cs="Calibri"/>
+          <w:sz w:val="22"/>
+          <w:szCs w:val="22"/>
+          <w:color w:val="000000"/>
+          <w:b/>
+          <w:bCs/>
+        </w:rPr>
+        <w:tab/>
+        <w:t xml:space="preserve">May 2020 – May 2021</w:t>
+      </w:r>
+    </w:p>
+    <w:p>
+      <w:pPr>
+        <w:rPr>
+          <w:rFonts w:cs="Calibri"/>
+          <w:bCs/>
+          <w:color w:val="000000" w:themeColor="text1"/>
+          <w:szCs w:val="21"/>
+        </w:rPr>
+        <w:spacing w:before="0" w:after="80" w:line="280" w:lineRule="exact"/>
+        <w:keepLines/>
+        <w:snapToGrid w:val="0"/>
+        <w:keepNext/>
+      </w:pPr>
+      <w:r>
+        <w:rPr>
+          <w:rFonts w:cs="Calibri"/>
+          <w:sz w:val="22"/>
+          <w:szCs w:val="22"/>
+          <w:color w:val="000000"/>
+        </w:rPr>
+      </w:r>
+      <w:r>
+        <w:rPr>
+          <w:rFonts w:cs="Calibri"/>
+          <w:sz w:val="21"/>
+          <w:szCs w:val="21"/>
+          <w:color w:val="595959"/>
+          <w:i/>
+        </w:rPr>
+        <w:t xml:space="preserve">Reagent Developer</w:t>
+      </w:r>
+    </w:p>
+    <w:p>
+      <w:pPr>
+        <w:rPr>
+          <w:rFonts w:cs="Calibri"/>
+          <w:bCs/>
+          <w:color w:val="000000" w:themeColor="text1"/>
+          <w:szCs w:val="21"/>
+        </w:rPr>
+        <w:spacing w:before="0" w:after="120" w:line="320" w:lineRule="exact"/>
+        <w:keepLines/>
+        <w:snapToGrid w:val="0"/>
+        <w:ind w:left="280" w:hanging="280"/>
+      </w:pPr>
+      <w:r>
+        <w:rPr>
+          <w:rFonts w:cs="Calibri"/>
+          <w:sz w:val="22"/>
+          <w:szCs w:val="22"/>
+          <w:color w:val="000000"/>
+        </w:rPr>
+        <w:t xml:space="preserve">•</w:t>
+        <w:tab/>
+      </w:r>
+      <w:r>
+        <w:rPr>
+          <w:rFonts w:cs="Calibri"/>
+          <w:sz w:val="22"/>
+          <w:szCs w:val="22"/>
+          <w:color w:val="000000"/>
+        </w:rPr>
+        <w:t xml:space="preserve">Contributed to sex-hormone immunoassay reagent development and an inhibin A (INH-A) project.</w:t>
+      </w:r>
+    </w:p>
+    <w:p>
+      <w:pPr>
+        <w:rPr>
+          <w:rFonts w:cs="Calibri"/>
+          <w:b/>
+          <w:color w:val="000000" w:themeColor="text1"/>
           <w:sz w:val="24"/>
           <w:szCs w:val="24"/>
-          <w:color w:val="000000"/>
-          <w:b/>
-          <w:bCs/>
-        </w:rPr>
-        <w:t xml:space="preserve">Sichuan WoWente Biotechnology Co., Ltd.</w:t>
-      </w:r>
-      <w:r>
-        <w:rPr>
-          <w:rFonts w:cs="Calibri"/>
-          <w:sz w:val="21"/>
-          <w:szCs w:val="21"/>
-          <w:color w:val="595959"/>
-        </w:rPr>
-        <w:tab/>
-        <w:t xml:space="preserve">May 2020 – May 2021</w:t>
-      </w:r>
-    </w:p>
-    <w:p>
-      <w:pPr>
-        <w:rPr>
-          <w:rFonts w:cs="Calibri"/>
-          <w:bCs/>
-          <w:color w:val="000000" w:themeColor="text1"/>
-          <w:szCs w:val="21"/>
-        </w:rPr>
-        <w:spacing w:before="0" w:after="80" w:line="280" w:lineRule="exact"/>
-        <w:keepLines/>
-        <w:snapToGrid w:val="0"/>
-        <w:keepNext/>
-      </w:pPr>
-      <w:r>
-        <w:rPr>
-          <w:rFonts w:cs="Calibri"/>
-          <w:sz w:val="22"/>
-          <w:szCs w:val="22"/>
-          <w:color w:val="000000"/>
-        </w:rPr>
-      </w:r>
-      <w:r>
-        <w:rPr>
-          <w:rFonts w:cs="Calibri"/>
-          <w:sz w:val="21"/>
-          <w:szCs w:val="21"/>
-          <w:color w:val="595959"/>
-          <w:i/>
-        </w:rPr>
-        <w:t xml:space="preserve">Reagent Developer</w:t>
-      </w:r>
-    </w:p>
-    <w:p>
-      <w:pPr>
-        <w:rPr>
-          <w:rFonts w:cs="Calibri"/>
-          <w:bCs/>
-          <w:color w:val="000000" w:themeColor="text1"/>
-          <w:szCs w:val="21"/>
-        </w:rPr>
-        <w:spacing w:before="0" w:after="120" w:line="320" w:lineRule="exact"/>
-        <w:keepLines/>
-        <w:snapToGrid w:val="0"/>
-        <w:ind w:left="280" w:hanging="280"/>
-      </w:pPr>
-      <w:r>
-        <w:rPr>
-          <w:rFonts w:cs="Calibri"/>
-          <w:sz w:val="22"/>
-          <w:szCs w:val="22"/>
-          <w:color w:val="000000"/>
-        </w:rPr>
-        <w:t xml:space="preserve">•</w:t>
-        <w:tab/>
-      </w:r>
-      <w:r>
-        <w:rPr>
-          <w:rFonts w:cs="Calibri"/>
-          <w:sz w:val="22"/>
-          <w:szCs w:val="22"/>
-          <w:color w:val="000000"/>
-        </w:rPr>
-        <w:t xml:space="preserve">Contributed to sex-hormone immunoassay reagent development and an inhibin A (INH-A) project.</w:t>
-      </w:r>
-    </w:p>
-    <w:p>
-      <w:pPr>
-        <w:rPr>
-          <w:rFonts w:cs="Calibri"/>
-          <w:b/>
-          <w:color w:val="000000" w:themeColor="text1"/>
-          <w:sz w:val="24"/>
-          <w:szCs w:val="24"/>
-        </w:rPr>
-        <w:spacing w:before="160" w:after="120" w:line="320" w:lineRule="exact"/>
+        </w:rPr>
+        <w:spacing w:before="180" w:after="140" w:line="320" w:lineRule="exact"/>
         <w:keepLines/>
         <w:snapToGrid w:val="0"/>
         <w:pBdr>
-          <w:bottom w:val="single" w:sz="12" w:space="3" w:color="000000"/>
+          <w:bottom w:val="single" w:sz="6" w:space="4" w:color="000000"/>
         </w:pBdr>
         <w:keepNext/>
       </w:pPr>
@@ -1880,7 +1906,7 @@
           <w:szCs w:val="24"/>
           <w:color w:val="000000"/>
           <w:b/>
-          <w:highlight w:val="lightGray"/>
+          <w:bCs/>
         </w:rPr>
         <w:t xml:space="preserve">TECHNICAL SKILLS</w:t>
       </w:r>
@@ -1904,6 +1930,7 @@
           <w:szCs w:val="22"/>
           <w:color w:val="000000"/>
           <w:b/>
+          <w:bCs/>
         </w:rPr>
         <w:t xml:space="preserve">AI and foundation models: </w:t>
       </w:r>
@@ -1936,6 +1963,7 @@
           <w:szCs w:val="22"/>
           <w:color w:val="000000"/>
           <w:b/>
+          <w:bCs/>
         </w:rPr>
         <w:t xml:space="preserve">Deep learning: </w:t>
       </w:r>
@@ -1968,6 +1996,7 @@
           <w:szCs w:val="22"/>
           <w:color w:val="000000"/>
           <w:b/>
+          <w:bCs/>
         </w:rPr>
         <w:t xml:space="preserve">Programming and computing: </w:t>
       </w:r>
@@ -2000,6 +2029,7 @@
           <w:szCs w:val="22"/>
           <w:color w:val="000000"/>
           <w:b/>
+          <w:bCs/>
         </w:rPr>
         <w:t xml:space="preserve">Bioinformatics: </w:t>
       </w:r>
@@ -2022,11 +2052,11 @@
           <w:sz w:val="24"/>
           <w:szCs w:val="24"/>
         </w:rPr>
-        <w:spacing w:before="160" w:after="120" w:line="320" w:lineRule="exact"/>
+        <w:spacing w:before="180" w:after="140" w:line="320" w:lineRule="exact"/>
         <w:keepLines/>
         <w:snapToGrid w:val="0"/>
         <w:pBdr>
-          <w:bottom w:val="single" w:sz="12" w:space="3" w:color="000000"/>
+          <w:bottom w:val="single" w:sz="6" w:space="4" w:color="000000"/>
         </w:pBdr>
         <w:keepNext/>
       </w:pPr>
@@ -2037,7 +2067,7 @@
           <w:szCs w:val="24"/>
           <w:color w:val="000000"/>
           <w:b/>
-          <w:highlight w:val="lightGray"/>
+          <w:bCs/>
         </w:rPr>
         <w:t xml:space="preserve">RESEARCH SOFTWARE</w:t>
       </w:r>
@@ -2068,8 +2098,9 @@
             <w:rFonts w:cs="Calibri"/>
             <w:sz w:val="22"/>
             <w:szCs w:val="22"/>
-            <w:color w:val="0000FF"/>
+            <w:color w:val="174A73"/>
             <w:b/>
+            <w:bCs/>
           </w:rPr>
           <w:t xml:space="preserve">github.com/hushuzuiniu</w:t>
         </w:r>

</xml_diff>

<commit_message>
Refine bilingual CVs in the preferred academic layout
</commit_message>
<xml_diff>
--- a/uploads/Shu_Hu_CV_EN.docx
+++ b/uploads/Shu_Hu_CV_EN.docx
@@ -363,7 +363,7 @@
           <w:szCs w:val="22"/>
           <w:color w:val="000000"/>
         </w:rPr>
-        <w:t xml:space="preserve">AI foundation models · Sequence representation learning · Deep learning · Viral evolution</w:t>
+        <w:t xml:space="preserve">Foundation models and deep learning for biological sequences, with applications in viral evolution, antibody–virus interactions and genomic epidemiology.</w:t>
       </w:r>
     </w:p>
     <w:p>
@@ -406,16 +406,19 @@
         <w:spacing w:before="0" w:after="120" w:line="320" w:lineRule="exact"/>
         <w:keepLines/>
         <w:snapToGrid w:val="0"/>
-        <w:ind w:left="280" w:hanging="280"/>
-      </w:pPr>
-      <w:r>
-        <w:rPr>
-          <w:rFonts w:cs="Calibri"/>
-          <w:sz w:val="22"/>
-          <w:szCs w:val="22"/>
-          <w:color w:val="000000"/>
-        </w:rPr>
-        <w:t xml:space="preserve">•</w:t>
+        <w:ind w:left="420" w:hanging="420"/>
+        <w:tabs>
+          <w:tab w:val="left" w:pos="420"/>
+        </w:tabs>
+      </w:pPr>
+      <w:r>
+        <w:rPr>
+          <w:rFonts w:cs="Calibri"/>
+          <w:sz w:val="22"/>
+          <w:szCs w:val="22"/>
+          <w:color w:val="000000"/>
+        </w:rPr>
+        <w:t xml:space="preserve">[1]</w:t>
         <w:tab/>
       </w:r>
       <w:r>
@@ -497,16 +500,19 @@
         <w:spacing w:before="0" w:after="120" w:line="320" w:lineRule="exact"/>
         <w:keepLines/>
         <w:snapToGrid w:val="0"/>
-        <w:ind w:left="280" w:hanging="280"/>
-      </w:pPr>
-      <w:r>
-        <w:rPr>
-          <w:rFonts w:cs="Calibri"/>
-          <w:sz w:val="22"/>
-          <w:szCs w:val="22"/>
-          <w:color w:val="000000"/>
-        </w:rPr>
-        <w:t xml:space="preserve">•</w:t>
+        <w:ind w:left="420" w:hanging="420"/>
+        <w:tabs>
+          <w:tab w:val="left" w:pos="420"/>
+        </w:tabs>
+      </w:pPr>
+      <w:r>
+        <w:rPr>
+          <w:rFonts w:cs="Calibri"/>
+          <w:sz w:val="22"/>
+          <w:szCs w:val="22"/>
+          <w:color w:val="000000"/>
+        </w:rPr>
+        <w:t xml:space="preserve">[2]</w:t>
         <w:tab/>
       </w:r>
       <w:r>
@@ -589,16 +595,19 @@
         <w:spacing w:before="0" w:after="120" w:line="320" w:lineRule="exact"/>
         <w:keepLines/>
         <w:snapToGrid w:val="0"/>
-        <w:ind w:left="280" w:hanging="280"/>
-      </w:pPr>
-      <w:r>
-        <w:rPr>
-          <w:rFonts w:cs="Calibri"/>
-          <w:sz w:val="22"/>
-          <w:szCs w:val="22"/>
-          <w:color w:val="000000"/>
-        </w:rPr>
-        <w:t xml:space="preserve">•</w:t>
+        <w:ind w:left="420" w:hanging="420"/>
+        <w:tabs>
+          <w:tab w:val="left" w:pos="420"/>
+        </w:tabs>
+      </w:pPr>
+      <w:r>
+        <w:rPr>
+          <w:rFonts w:cs="Calibri"/>
+          <w:sz w:val="22"/>
+          <w:szCs w:val="22"/>
+          <w:color w:val="000000"/>
+        </w:rPr>
+        <w:t xml:space="preserve">[3]</w:t>
         <w:tab/>
       </w:r>
       <w:r>
@@ -681,16 +690,19 @@
         <w:spacing w:before="0" w:after="120" w:line="320" w:lineRule="exact"/>
         <w:keepLines/>
         <w:snapToGrid w:val="0"/>
-        <w:ind w:left="280" w:hanging="280"/>
-      </w:pPr>
-      <w:r>
-        <w:rPr>
-          <w:rFonts w:cs="Calibri"/>
-          <w:sz w:val="22"/>
-          <w:szCs w:val="22"/>
-          <w:color w:val="000000"/>
-        </w:rPr>
-        <w:t xml:space="preserve">•</w:t>
+        <w:ind w:left="420" w:hanging="420"/>
+        <w:tabs>
+          <w:tab w:val="left" w:pos="420"/>
+        </w:tabs>
+      </w:pPr>
+      <w:r>
+        <w:rPr>
+          <w:rFonts w:cs="Calibri"/>
+          <w:sz w:val="22"/>
+          <w:szCs w:val="22"/>
+          <w:color w:val="000000"/>
+        </w:rPr>
+        <w:t xml:space="preserve">[4]</w:t>
         <w:tab/>
       </w:r>
       <w:r>
@@ -773,16 +785,19 @@
         <w:spacing w:before="0" w:after="120" w:line="320" w:lineRule="exact"/>
         <w:keepLines/>
         <w:snapToGrid w:val="0"/>
-        <w:ind w:left="280" w:hanging="280"/>
-      </w:pPr>
-      <w:r>
-        <w:rPr>
-          <w:rFonts w:cs="Calibri"/>
-          <w:sz w:val="22"/>
-          <w:szCs w:val="22"/>
-          <w:color w:val="000000"/>
-        </w:rPr>
-        <w:t xml:space="preserve">•</w:t>
+        <w:ind w:left="420" w:hanging="420"/>
+        <w:tabs>
+          <w:tab w:val="left" w:pos="420"/>
+        </w:tabs>
+      </w:pPr>
+      <w:r>
+        <w:rPr>
+          <w:rFonts w:cs="Calibri"/>
+          <w:sz w:val="22"/>
+          <w:szCs w:val="22"/>
+          <w:color w:val="000000"/>
+        </w:rPr>
+        <w:t xml:space="preserve">[5]</w:t>
         <w:tab/>
       </w:r>
       <w:r>
@@ -865,16 +880,19 @@
         <w:spacing w:before="0" w:after="120" w:line="320" w:lineRule="exact"/>
         <w:keepLines/>
         <w:snapToGrid w:val="0"/>
-        <w:ind w:left="280" w:hanging="280"/>
-      </w:pPr>
-      <w:r>
-        <w:rPr>
-          <w:rFonts w:cs="Calibri"/>
-          <w:sz w:val="22"/>
-          <w:szCs w:val="22"/>
-          <w:color w:val="000000"/>
-        </w:rPr>
-        <w:t xml:space="preserve">•</w:t>
+        <w:ind w:left="420" w:hanging="420"/>
+        <w:tabs>
+          <w:tab w:val="left" w:pos="420"/>
+        </w:tabs>
+      </w:pPr>
+      <w:r>
+        <w:rPr>
+          <w:rFonts w:cs="Calibri"/>
+          <w:sz w:val="22"/>
+          <w:szCs w:val="22"/>
+          <w:color w:val="000000"/>
+        </w:rPr>
+        <w:t xml:space="preserve">[6]</w:t>
         <w:tab/>
       </w:r>
       <w:r>
@@ -956,16 +974,19 @@
         <w:spacing w:before="0" w:after="120" w:line="320" w:lineRule="exact"/>
         <w:keepLines/>
         <w:snapToGrid w:val="0"/>
-        <w:ind w:left="280" w:hanging="280"/>
-      </w:pPr>
-      <w:r>
-        <w:rPr>
-          <w:rFonts w:cs="Calibri"/>
-          <w:sz w:val="22"/>
-          <w:szCs w:val="22"/>
-          <w:color w:val="000000"/>
-        </w:rPr>
-        <w:t xml:space="preserve">•</w:t>
+        <w:ind w:left="420" w:hanging="420"/>
+        <w:tabs>
+          <w:tab w:val="left" w:pos="420"/>
+        </w:tabs>
+      </w:pPr>
+      <w:r>
+        <w:rPr>
+          <w:rFonts w:cs="Calibri"/>
+          <w:sz w:val="22"/>
+          <w:szCs w:val="22"/>
+          <w:color w:val="000000"/>
+        </w:rPr>
+        <w:t xml:space="preserve">[7]</w:t>
         <w:tab/>
       </w:r>
       <w:r>
@@ -1048,16 +1069,19 @@
         <w:spacing w:before="0" w:after="120" w:line="320" w:lineRule="exact"/>
         <w:keepLines/>
         <w:snapToGrid w:val="0"/>
-        <w:ind w:left="280" w:hanging="280"/>
-      </w:pPr>
-      <w:r>
-        <w:rPr>
-          <w:rFonts w:cs="Calibri"/>
-          <w:sz w:val="22"/>
-          <w:szCs w:val="22"/>
-          <w:color w:val="000000"/>
-        </w:rPr>
-        <w:t xml:space="preserve">•</w:t>
+        <w:ind w:left="420" w:hanging="420"/>
+        <w:tabs>
+          <w:tab w:val="left" w:pos="420"/>
+        </w:tabs>
+      </w:pPr>
+      <w:r>
+        <w:rPr>
+          <w:rFonts w:cs="Calibri"/>
+          <w:sz w:val="22"/>
+          <w:szCs w:val="22"/>
+          <w:color w:val="000000"/>
+        </w:rPr>
+        <w:t xml:space="preserve">[8]</w:t>
         <w:tab/>
       </w:r>
       <w:r>
@@ -1261,7 +1285,7 @@
           <w:szCs w:val="22"/>
           <w:color w:val="000000"/>
         </w:rPr>
-        <w:t xml:space="preserve">Co-developed the UniCAV model and training framework; curated datasets, conducted computational analyses and benchmarks, and drafted the manuscript (Cell Reports Methods, under revision).</w:t>
+        <w:t xml:space="preserve">Co-developed UniCAV for HIV-1 neutralization prediction using protein language models; curated data, trained and benchmarked models, and drafted the manuscript (Cell Reports Methods, under revision).</w:t>
       </w:r>
     </w:p>
     <w:p>
@@ -1294,7 +1318,7 @@
           <w:szCs w:val="22"/>
           <w:color w:val="000000"/>
         </w:rPr>
-        <w:t xml:space="preserve">Contributed to ViroBench, a benchmark study of nucleotide foundation models published at KDD 2026.</w:t>
+        <w:t xml:space="preserve">Contributed to ViroBench, a benchmark of nucleotide foundation models for viral genomics (KDD 2026).</w:t>
       </w:r>
     </w:p>
     <w:p>
@@ -1399,18 +1423,18 @@
           <w:szCs w:val="22"/>
           <w:color w:val="000000"/>
         </w:rPr>
-        <w:t xml:space="preserve">Conducted bioinformatics analyses of influenza and RSV, integrating genomic, clinical and immunological datasets.</w:t>
-      </w:r>
-    </w:p>
-    <w:p>
-      <w:pPr>
-        <w:rPr>
-          <w:rFonts w:cs="Calibri"/>
-          <w:bCs/>
-          <w:color w:val="000000" w:themeColor="text1"/>
-          <w:szCs w:val="21"/>
-        </w:rPr>
-        <w:spacing w:before="0" w:after="80" w:line="320" w:lineRule="exact"/>
+        <w:t xml:space="preserve">Contributed to deep-learning phylodynamics research combining contact-tracing and phylogenetic data; co-authored the resulting Molecular Biology and Evolution paper (2024).</w:t>
+      </w:r>
+    </w:p>
+    <w:p>
+      <w:pPr>
+        <w:rPr>
+          <w:rFonts w:cs="Calibri"/>
+          <w:bCs/>
+          <w:color w:val="000000" w:themeColor="text1"/>
+          <w:szCs w:val="21"/>
+        </w:rPr>
+        <w:spacing w:before="0" w:after="140" w:line="320" w:lineRule="exact"/>
         <w:keepLines/>
         <w:snapToGrid w:val="0"/>
         <w:ind w:left="280" w:hanging="280"/>
@@ -1432,40 +1456,7 @@
           <w:szCs w:val="22"/>
           <w:color w:val="000000"/>
         </w:rPr>
-        <w:t xml:space="preserve">Contributed to research integrating contact-tracing data with phylogenetic analysis for outbreak inference; co-authored the resulting Molecular Biology and Evolution paper (2024).</w:t>
-      </w:r>
-    </w:p>
-    <w:p>
-      <w:pPr>
-        <w:rPr>
-          <w:rFonts w:cs="Calibri"/>
-          <w:bCs/>
-          <w:color w:val="000000" w:themeColor="text1"/>
-          <w:szCs w:val="21"/>
-        </w:rPr>
-        <w:spacing w:before="0" w:after="140" w:line="320" w:lineRule="exact"/>
-        <w:keepLines/>
-        <w:snapToGrid w:val="0"/>
-        <w:ind w:left="280" w:hanging="280"/>
-      </w:pPr>
-      <w:r>
-        <w:rPr>
-          <w:rFonts w:cs="Calibri"/>
-          <w:sz w:val="22"/>
-          <w:szCs w:val="22"/>
-          <w:color w:val="000000"/>
-        </w:rPr>
-        <w:t xml:space="preserve">•</w:t>
-        <w:tab/>
-      </w:r>
-      <w:r>
-        <w:rPr>
-          <w:rFonts w:cs="Calibri"/>
-          <w:sz w:val="22"/>
-          <w:szCs w:val="22"/>
-          <w:color w:val="000000"/>
-        </w:rPr>
-        <w:t xml:space="preserve">Participated in genomic epidemiology studies of avian influenza in Cambodia and southern China, contributing to publications in NEJM and Journal of Virology (2025).</w:t>
+        <w:t xml:space="preserve">Analysed influenza and RSV genomic data; contributed to avian-influenza genomic epidemiology studies in Cambodia and southern China (NEJM and Journal of Virology, 2025).</w:t>
       </w:r>
     </w:p>
     <w:p>
@@ -1570,7 +1561,7 @@
           <w:szCs w:val="22"/>
           <w:color w:val="000000"/>
         </w:rPr>
-        <w:t xml:space="preserve">Developed analysis methods for BCL6, BCL2 and MYC gene fusions in DLBCL sequencing workflows, addressing discrepancies between NGS and FISH results.</w:t>
+        <w:t xml:space="preserve">Developed gene-fusion analysis methods for BCL6, BCL2 and MYC in DLBCL sequencing workflows, addressing discrepancies between NGS and FISH results.</w:t>
       </w:r>
     </w:p>
     <w:p>
@@ -1603,7 +1594,7 @@
           <w:szCs w:val="22"/>
           <w:color w:val="000000"/>
         </w:rPr>
-        <w:t xml:space="preserve">Established low-depth whole-genome sequencing workflows for copy-number analysis using QDNAseq, Control-FREEC and ichorCNA.</w:t>
+        <w:t xml:space="preserve">Established low-depth WGS copy-number analysis workflows using QDNAseq, Control-FREEC and ichorCNA.</w:t>
       </w:r>
     </w:p>
     <w:p>
@@ -1636,7 +1627,7 @@
           <w:szCs w:val="22"/>
           <w:color w:val="000000"/>
         </w:rPr>
-        <w:t xml:space="preserve">Built upstream and downstream single-cell RNA-seq workflows and collaborated with IT colleagues to deploy analyses on an automated platform.</w:t>
+        <w:t xml:space="preserve">Built configurable single-cell RNA-seq workflows in Shell and R; collaborated with IT colleagues on automated platform deployment.</w:t>
       </w:r>
     </w:p>
     <w:p>
@@ -1709,7 +1700,7 @@
           <w:bCs/>
         </w:rPr>
         <w:tab/>
-        <w:t xml:space="preserve">Feb – Sep 2022</w:t>
+        <w:t xml:space="preserve">Feb 2022 – Sep 2022</w:t>
       </w:r>
     </w:p>
     <w:p>
@@ -1774,7 +1765,7 @@
           <w:szCs w:val="22"/>
           <w:color w:val="000000"/>
         </w:rPr>
-        <w:t xml:space="preserve">Developed reusable Shiny modules and R scripts for interactive exploration of RNA-seq datasets during MSc study at the University of Edinburgh.</w:t>
+        <w:t xml:space="preserve">Developed reusable R Shiny modules and scripts for interactive exploration of RNA-seq data.</w:t>
       </w:r>
     </w:p>
     <w:p>
@@ -1932,16 +1923,16 @@
           <w:b/>
           <w:bCs/>
         </w:rPr>
-        <w:t xml:space="preserve">AI and foundation models: </w:t>
-      </w:r>
-      <w:r>
-        <w:rPr>
-          <w:rFonts w:cs="Calibri"/>
-          <w:sz w:val="22"/>
-          <w:szCs w:val="22"/>
-          <w:color w:val="000000"/>
-        </w:rPr>
-        <w:t xml:space="preserve">Nucleotide foundation-model benchmarking; protein language models; biological sequence representations.</w:t>
+        <w:t xml:space="preserve">Foundation models: </w:t>
+      </w:r>
+      <w:r>
+        <w:rPr>
+          <w:rFonts w:cs="Calibri"/>
+          <w:sz w:val="22"/>
+          <w:szCs w:val="22"/>
+          <w:color w:val="000000"/>
+        </w:rPr>
+        <w:t xml:space="preserve">Protein language models (ESM-C, AntiBERTa2); nucleotide model benchmarking; biological sequence representation learning.</w:t>
       </w:r>
     </w:p>
     <w:p>
@@ -1974,7 +1965,7 @@
           <w:szCs w:val="22"/>
           <w:color w:val="000000"/>
         </w:rPr>
-        <w:t xml:space="preserve">Model development, training, evaluation, benchmarking and interpretation.</w:t>
+        <w:t xml:space="preserve">PyTorch, Hugging Face Transformers, scikit-learn; model development, training, evaluation and interpretation.</w:t>
       </w:r>
     </w:p>
     <w:p>
@@ -1998,16 +1989,16 @@
           <w:b/>
           <w:bCs/>
         </w:rPr>
-        <w:t xml:space="preserve">Programming and computing: </w:t>
-      </w:r>
-      <w:r>
-        <w:rPr>
-          <w:rFonts w:cs="Calibri"/>
-          <w:sz w:val="22"/>
-          <w:szCs w:val="22"/>
-          <w:color w:val="000000"/>
-        </w:rPr>
-        <w:t xml:space="preserve">R, Python, Linux, Shell, Docker, SQL.</w:t>
+        <w:t xml:space="preserve">Programming: </w:t>
+      </w:r>
+      <w:r>
+        <w:rPr>
+          <w:rFonts w:cs="Calibri"/>
+          <w:sz w:val="22"/>
+          <w:szCs w:val="22"/>
+          <w:color w:val="000000"/>
+        </w:rPr>
+        <w:t xml:space="preserve">Python, R (Shiny), Shell, Linux, Docker, SQL, Git.</w:t>
       </w:r>
     </w:p>
     <w:p>
@@ -2040,7 +2031,7 @@
           <w:szCs w:val="22"/>
           <w:color w:val="000000"/>
         </w:rPr>
-        <w:t xml:space="preserve">Phylogenetics, BEAST, Nextstrain, RNA-seq, single-cell RNA-seq, WGS and copy-number analysis.</w:t>
+        <w:t xml:space="preserve">Phylogenetics and phylodynamics (BEAST, Nextstrain); RNA-seq, single-cell RNA-seq, WGS copy-number analysis and gene-fusion detection.</w:t>
       </w:r>
     </w:p>
     <w:p>

</xml_diff>